<commit_message>
ADD a second REAMDE file
</commit_message>
<xml_diff>
--- a/documentation/reports/final_report/Final_Report_30092026_v1.0.docx
+++ b/documentation/reports/final_report/Final_Report_30092026_v1.0.docx
@@ -766,34 +766,39 @@
     <w:p>
       <w:pPr>
         <w:pStyle w:val="Heading1"/>
-        <w:rPr>
-          <w:lang w:val="en-US"/>
-        </w:rPr>
-      </w:pPr>
-      <w:r>
-        <w:rPr>
-          <w:lang w:val="en-US"/>
-        </w:rPr>
-        <w:t>I</w:t>
-      </w:r>
-      <w:r>
-        <w:rPr>
-          <w:lang w:val="en-US"/>
-        </w:rPr>
-        <w:t>nput Data</w:t>
-      </w:r>
-    </w:p>
-    <w:p>
-      <w:pPr>
-        <w:rPr>
-          <w:lang w:val="en-US"/>
-        </w:rPr>
-      </w:pPr>
-      <w:r>
-        <w:rPr>
-          <w:lang w:val="en-US"/>
-        </w:rPr>
-        <w:t>Single-cell RNA-seq data is available in the NCBI Gene expression Omnibus database (GEO) with accession number GSE234832.</w:t>
+      </w:pPr>
+      <w:r>
+        <w:t>Data Availability &amp; Reference</w:t>
+      </w:r>
+    </w:p>
+    <w:p>
+      <w:pPr>
+        <w:rPr>
+          <w:lang w:val="en-US"/>
+        </w:rPr>
+      </w:pPr>
+      <w:r>
+        <w:rPr>
+          <w:lang w:val="en-US"/>
+        </w:rPr>
+        <w:t xml:space="preserve">The single-cell RNA-seq data used in this reanalysis is available in the NCBI Gene Expression Omnibus (GEO) database under accession number </w:t>
+      </w:r>
+      <w:hyperlink r:id="rId13" w:history="1">
+        <w:r>
+          <w:rPr>
+            <w:rStyle w:val="Hyperlink"/>
+            <w:b/>
+            <w:bCs/>
+            <w:lang w:val="en-US"/>
+          </w:rPr>
+          <w:t>GSE234832</w:t>
+        </w:r>
+      </w:hyperlink>
+      <w:r>
+        <w:rPr>
+          <w:lang w:val="en-US"/>
+        </w:rPr>
+        <w:t>.</w:t>
       </w:r>
     </w:p>
     <w:p>
@@ -807,6 +812,125 @@
           <w:lang w:val="en-US"/>
         </w:rPr>
         <w:lastRenderedPageBreak/>
+        <w:t>If you use this data, please cite the original study:</w:t>
+      </w:r>
+    </w:p>
+    <w:p>
+      <w:pPr>
+        <w:rPr>
+          <w:lang w:val="en-US"/>
+        </w:rPr>
+      </w:pPr>
+      <w:r>
+        <w:rPr>
+          <w:lang w:val="nl-NL"/>
+        </w:rPr>
+        <w:t xml:space="preserve">Song Q, Ruiz J, </w:t>
+      </w:r>
+      <w:proofErr w:type="spellStart"/>
+      <w:r>
+        <w:rPr>
+          <w:lang w:val="nl-NL"/>
+        </w:rPr>
+        <w:t>Xing</w:t>
+      </w:r>
+      <w:proofErr w:type="spellEnd"/>
+      <w:r>
+        <w:rPr>
+          <w:lang w:val="nl-NL"/>
+        </w:rPr>
+        <w:t xml:space="preserve"> F, Lo HW et al. </w:t>
+      </w:r>
+      <w:r>
+        <w:rPr>
+          <w:lang w:val="en-US"/>
+        </w:rPr>
+        <w:t xml:space="preserve">(2023). </w:t>
+      </w:r>
+      <w:r>
+        <w:rPr>
+          <w:b/>
+          <w:bCs/>
+          <w:lang w:val="en-US"/>
+        </w:rPr>
+        <w:t>Single-cell sequencing reveals the landscape of the human brain metastatic microenvironment.</w:t>
+      </w:r>
+      <w:r>
+        <w:rPr>
+          <w:lang w:val="en-US"/>
+        </w:rPr>
+        <w:t xml:space="preserve"> </w:t>
+      </w:r>
+      <w:r>
+        <w:rPr>
+          <w:i/>
+          <w:iCs/>
+          <w:lang w:val="en-US"/>
+        </w:rPr>
+        <w:t>Commun Biol</w:t>
+      </w:r>
+      <w:r>
+        <w:rPr>
+          <w:lang w:val="en-US"/>
+        </w:rPr>
+        <w:t xml:space="preserve"> 6, 760. DOI: </w:t>
+      </w:r>
+      <w:hyperlink r:id="rId14" w:history="1">
+        <w:r>
+          <w:rPr>
+            <w:rStyle w:val="Hyperlink"/>
+            <w:lang w:val="en-US"/>
+          </w:rPr>
+          <w:t xml:space="preserve">10.1038/s42003-023-05124-2IF: 5.8 Q1 </w:t>
+        </w:r>
+      </w:hyperlink>
+      <w:r>
+        <w:rPr>
+          <w:lang w:val="en-US"/>
+        </w:rPr>
+        <w:t xml:space="preserve">| PMID: </w:t>
+      </w:r>
+      <w:hyperlink r:id="rId15" w:history="1">
+        <w:r>
+          <w:rPr>
+            <w:rStyle w:val="Hyperlink"/>
+            <w:lang w:val="en-US"/>
+          </w:rPr>
+          <w:t>37479733IF: 5.8 Q1</w:t>
+        </w:r>
+      </w:hyperlink>
+    </w:p>
+    <w:p>
+      <w:pPr>
+        <w:rPr>
+          <w:rFonts w:asciiTheme="majorHAnsi" w:eastAsiaTheme="majorEastAsia" w:hAnsiTheme="majorHAnsi" w:cstheme="majorBidi"/>
+          <w:color w:val="0F4761" w:themeColor="accent1" w:themeShade="BF"/>
+          <w:sz w:val="40"/>
+          <w:szCs w:val="40"/>
+          <w:lang w:val="en-US"/>
+        </w:rPr>
+      </w:pPr>
+      <w:r>
+        <w:rPr>
+          <w:rFonts w:asciiTheme="majorHAnsi" w:eastAsiaTheme="majorEastAsia" w:hAnsiTheme="majorHAnsi" w:cstheme="majorBidi"/>
+          <w:color w:val="0F4761" w:themeColor="accent1" w:themeShade="BF"/>
+          <w:sz w:val="40"/>
+          <w:szCs w:val="40"/>
+          <w:lang w:val="en-US"/>
+        </w:rPr>
+        <w:t>Dataset Description</w:t>
+      </w:r>
+    </w:p>
+    <w:p>
+      <w:pPr>
+        <w:rPr>
+          <w:lang w:val="en-US"/>
+        </w:rPr>
+      </w:pPr>
+      <w:r>
+        <w:rPr>
+          <w:lang w:val="en-US"/>
+        </w:rPr>
         <w:t>Data from five brain metastasis samples were loaded and processed using Seurat. The dataset included three breast cancer brain metastasis samples and two lung cancer brain metastasis samples.</w:t>
       </w:r>
     </w:p>
@@ -1092,6 +1216,7 @@
         <w:rPr>
           <w:lang w:val="en-US"/>
         </w:rPr>
+        <w:lastRenderedPageBreak/>
         <w:t>Normalization, Identification of Variable Features, and Scaling</w:t>
       </w:r>
     </w:p>
@@ -1203,49 +1328,329 @@
         <w:rPr>
           <w:lang w:val="en-US"/>
         </w:rPr>
+        <w:t>Principal Component Analysis (PCA)</w:t>
+      </w:r>
+    </w:p>
+    <w:p>
+      <w:pPr>
+        <w:rPr>
+          <w:lang w:val="en-US"/>
+        </w:rPr>
+      </w:pPr>
+      <w:r>
+        <w:rPr>
+          <w:lang w:val="en-US"/>
+        </w:rPr>
+        <w:t xml:space="preserve">Linear dimensional reduction was performed on the scaled expression matrix of the top 2,000 highly variable features using </w:t>
+      </w:r>
+      <w:proofErr w:type="spellStart"/>
+      <w:r>
+        <w:rPr>
+          <w:lang w:val="en-US"/>
+        </w:rPr>
+        <w:t>RunPCA</w:t>
+      </w:r>
+      <w:proofErr w:type="spellEnd"/>
+      <w:r>
+        <w:rPr>
+          <w:lang w:val="en-US"/>
+        </w:rPr>
+        <w:t>. Dimensional loadings and primary sources of variation were evaluated across the top principal components. The proportion of variance explained by individual PCs was assessed using elbow plot visualization (</w:t>
+      </w:r>
+      <w:proofErr w:type="spellStart"/>
+      <w:r>
+        <w:rPr>
+          <w:lang w:val="en-US"/>
+        </w:rPr>
+        <w:t>ElbowPlot</w:t>
+      </w:r>
+      <w:proofErr w:type="spellEnd"/>
+      <w:r>
+        <w:rPr>
+          <w:lang w:val="en-US"/>
+        </w:rPr>
+        <w:t>) over 50 dimensions to determine the optimal component cutoff for batch alignment and downstream embeddings.</w:t>
+      </w:r>
+    </w:p>
+    <w:p>
+      <w:pPr>
+        <w:pStyle w:val="Heading2"/>
+        <w:rPr>
+          <w:lang w:val="en-US"/>
+        </w:rPr>
+      </w:pPr>
+      <w:r>
+        <w:rPr>
+          <w:lang w:val="en-US"/>
+        </w:rPr>
+        <w:t>Harmony Integration</w:t>
+      </w:r>
+    </w:p>
+    <w:p>
+      <w:pPr>
+        <w:rPr>
+          <w:lang w:val="en-US"/>
+        </w:rPr>
+      </w:pPr>
+      <w:r>
+        <w:rPr>
+          <w:lang w:val="en-US"/>
+        </w:rPr>
+        <w:t>To mitigate sample-specific batch effects across the five metastasis specimens, batch correction was executed on the top 30 principal components using the Harmony algorithm (</w:t>
+      </w:r>
+      <w:proofErr w:type="spellStart"/>
+      <w:r>
+        <w:rPr>
+          <w:lang w:val="en-US"/>
+        </w:rPr>
+        <w:t>RunHarmony</w:t>
+      </w:r>
+      <w:proofErr w:type="spellEnd"/>
+      <w:r>
+        <w:rPr>
+          <w:lang w:val="en-US"/>
+        </w:rPr>
+        <w:t>) with sample identity (</w:t>
+      </w:r>
+      <w:proofErr w:type="spellStart"/>
+      <w:r>
+        <w:rPr>
+          <w:lang w:val="en-US"/>
+        </w:rPr>
+        <w:t>orig.ident</w:t>
+      </w:r>
+      <w:proofErr w:type="spellEnd"/>
+      <w:r>
+        <w:rPr>
+          <w:lang w:val="en-US"/>
+        </w:rPr>
+        <w:t>) set as the batch variable and a diversity penalty parameter (theta = 4). Harmony embeddings (harmony) were generated for downstream dimensional reduction and graph-based clustering.</w:t>
+      </w:r>
+    </w:p>
+    <w:p>
+      <w:pPr>
+        <w:pStyle w:val="Heading2"/>
+        <w:rPr>
+          <w:lang w:val="en-US"/>
+        </w:rPr>
+      </w:pPr>
+      <w:r>
+        <w:rPr>
+          <w:lang w:val="en-US"/>
+        </w:rPr>
+        <w:t>Clustering</w:t>
+      </w:r>
+    </w:p>
+    <w:p>
+      <w:pPr>
+        <w:rPr>
+          <w:lang w:val="en-US"/>
+        </w:rPr>
+      </w:pPr>
+      <w:r>
+        <w:rPr>
+          <w:lang w:val="en-US"/>
+        </w:rPr>
+        <w:t xml:space="preserve">Graph-based unsupervised clustering was performed before and after Harmony batch correction for comparison. Cell-cell similarity graphs were constructed using </w:t>
+      </w:r>
+      <w:proofErr w:type="spellStart"/>
+      <w:r>
+        <w:rPr>
+          <w:lang w:val="en-US"/>
+        </w:rPr>
+        <w:t>FindNeighbors</w:t>
+      </w:r>
+      <w:proofErr w:type="spellEnd"/>
+      <w:r>
+        <w:rPr>
+          <w:lang w:val="en-US"/>
+        </w:rPr>
+        <w:t xml:space="preserve"> based on either the first 30 uncorrected principal components or the first 30 Harmony-integrated dimensions. </w:t>
+      </w:r>
+      <w:r>
+        <w:rPr>
+          <w:lang w:val="en-US"/>
+        </w:rPr>
+        <w:t>We then performed community detection with</w:t>
+      </w:r>
+      <w:r>
+        <w:rPr>
+          <w:lang w:val="en-US"/>
+        </w:rPr>
+        <w:t xml:space="preserve"> </w:t>
+      </w:r>
+      <w:proofErr w:type="spellStart"/>
+      <w:r>
+        <w:rPr>
+          <w:lang w:val="en-US"/>
+        </w:rPr>
+        <w:t>FindClusters</w:t>
+      </w:r>
+      <w:proofErr w:type="spellEnd"/>
+      <w:r>
+        <w:rPr>
+          <w:lang w:val="en-US"/>
+        </w:rPr>
+        <w:t xml:space="preserve"> at a modularity resolution of 0.5.</w:t>
+      </w:r>
+    </w:p>
+    <w:p>
+      <w:pPr>
+        <w:pStyle w:val="Heading2"/>
+        <w:rPr>
+          <w:lang w:val="en-US"/>
+        </w:rPr>
+      </w:pPr>
+      <w:r>
+        <w:rPr>
+          <w:lang w:val="en-US"/>
+        </w:rPr>
+        <w:t>Clusters Visualization (UMAP and t-SNE)</w:t>
+      </w:r>
+    </w:p>
+    <w:p>
+      <w:pPr>
+        <w:rPr>
+          <w:lang w:val="en-US"/>
+        </w:rPr>
+      </w:pPr>
+      <w:r>
+        <w:rPr>
+          <w:lang w:val="en-US"/>
+        </w:rPr>
+        <w:t>For non-linear dimensional reduction and spatial visualization, Uniform Manifold Approximation and Projection (UMAP) embeddings were generated before (</w:t>
+      </w:r>
+      <w:proofErr w:type="spellStart"/>
+      <w:r>
+        <w:rPr>
+          <w:lang w:val="en-US"/>
+        </w:rPr>
+        <w:t>umap_pca</w:t>
+      </w:r>
+      <w:proofErr w:type="spellEnd"/>
+      <w:r>
+        <w:rPr>
+          <w:lang w:val="en-US"/>
+        </w:rPr>
+        <w:t>) and after batch correction (</w:t>
+      </w:r>
+      <w:proofErr w:type="spellStart"/>
+      <w:r>
+        <w:rPr>
+          <w:lang w:val="en-US"/>
+        </w:rPr>
+        <w:t>umap</w:t>
+      </w:r>
+      <w:proofErr w:type="spellEnd"/>
+      <w:r>
+        <w:rPr>
+          <w:lang w:val="en-US"/>
+        </w:rPr>
+        <w:t>) using the first 30 dimensions. In addition, t-Distributed Stochastic Neighbor Embedding (t-SNE) was performed on the 30 Harmony dimensions (</w:t>
+      </w:r>
+      <w:proofErr w:type="spellStart"/>
+      <w:r>
+        <w:rPr>
+          <w:lang w:val="en-US"/>
+        </w:rPr>
+        <w:t>RunTSNE</w:t>
+      </w:r>
+      <w:proofErr w:type="spellEnd"/>
+      <w:r>
+        <w:rPr>
+          <w:lang w:val="en-US"/>
+        </w:rPr>
+        <w:t>, reduction.name = "</w:t>
+      </w:r>
+      <w:proofErr w:type="spellStart"/>
+      <w:r>
+        <w:rPr>
+          <w:lang w:val="en-US"/>
+        </w:rPr>
+        <w:t>tsne_harmony</w:t>
+      </w:r>
+      <w:proofErr w:type="spellEnd"/>
+      <w:r>
+        <w:rPr>
+          <w:lang w:val="en-US"/>
+        </w:rPr>
+        <w:t>"). Cluster distributions and batch mixing across individual samples were evaluated on UMAP and t-SNE projections.</w:t>
+      </w:r>
+    </w:p>
+    <w:p>
+      <w:pPr>
+        <w:pStyle w:val="Heading2"/>
+        <w:rPr>
+          <w:lang w:val="en-US"/>
+        </w:rPr>
+      </w:pPr>
+      <w:r>
+        <w:rPr>
+          <w:lang w:val="en-US"/>
+        </w:rPr>
+        <w:t>Identification of Clusters Marker Genes</w:t>
+      </w:r>
+    </w:p>
+    <w:p>
+      <w:pPr>
+        <w:rPr>
+          <w:lang w:val="en-US"/>
+        </w:rPr>
+      </w:pPr>
+      <w:r>
+        <w:rPr>
+          <w:lang w:val="en-US"/>
+        </w:rPr>
+        <w:t xml:space="preserve">Differentially expressed gene (DEG) markers defining each integrated cluster were identified using Seurat's </w:t>
+      </w:r>
+      <w:proofErr w:type="spellStart"/>
+      <w:r>
+        <w:rPr>
+          <w:lang w:val="en-US"/>
+        </w:rPr>
+        <w:t>FindAllMarkers</w:t>
+      </w:r>
+      <w:proofErr w:type="spellEnd"/>
+      <w:r>
+        <w:rPr>
+          <w:lang w:val="en-US"/>
+        </w:rPr>
+        <w:t xml:space="preserve"> function. Non-parametric Wilcoxon rank-sum tests were conducted evaluating positively expressed genes (</w:t>
+      </w:r>
+      <w:proofErr w:type="spellStart"/>
+      <w:r>
+        <w:rPr>
+          <w:lang w:val="en-US"/>
+        </w:rPr>
+        <w:t>only.pos</w:t>
+      </w:r>
+      <w:proofErr w:type="spellEnd"/>
+      <w:r>
+        <w:rPr>
+          <w:lang w:val="en-US"/>
+        </w:rPr>
+        <w:t xml:space="preserve"> = TRUE) detected in a minimum fraction of 25% of cells in either comparison group (min.pct = 0.25) with a natural log fold-change threshold of at least </w:t>
+      </w:r>
+      <w:r>
+        <w:rPr>
+          <w:lang w:val="en-US"/>
+        </w:rPr>
         <w:lastRenderedPageBreak/>
-        <w:t>Principal Component Analysis (PCA)</w:t>
-      </w:r>
-    </w:p>
-    <w:p>
-      <w:pPr>
-        <w:rPr>
-          <w:lang w:val="en-US"/>
-        </w:rPr>
-      </w:pPr>
-      <w:r>
-        <w:rPr>
-          <w:lang w:val="en-US"/>
-        </w:rPr>
-        <w:t xml:space="preserve">Linear dimensional reduction was performed on the scaled expression matrix of the top 2,000 highly variable features using </w:t>
-      </w:r>
-      <w:proofErr w:type="spellStart"/>
-      <w:r>
-        <w:rPr>
-          <w:lang w:val="en-US"/>
-        </w:rPr>
-        <w:t>RunPCA</w:t>
-      </w:r>
-      <w:proofErr w:type="spellEnd"/>
-      <w:r>
-        <w:rPr>
-          <w:lang w:val="en-US"/>
-        </w:rPr>
-        <w:t>. Dimensional loadings and primary sources of variation were evaluated across the top principal components. The proportion of variance explained by individual PCs was assessed using elbow plot visualization (</w:t>
-      </w:r>
-      <w:proofErr w:type="spellStart"/>
-      <w:r>
-        <w:rPr>
-          <w:lang w:val="en-US"/>
-        </w:rPr>
-        <w:t>ElbowPlot</w:t>
-      </w:r>
-      <w:proofErr w:type="spellEnd"/>
-      <w:r>
-        <w:rPr>
-          <w:lang w:val="en-US"/>
-        </w:rPr>
-        <w:t>) over 50 dimensions to determine the optimal component cutoff for batch alignment and downstream embeddings.</w:t>
+        <w:t>0.25 (</w:t>
+      </w:r>
+      <w:proofErr w:type="spellStart"/>
+      <w:r>
+        <w:rPr>
+          <w:lang w:val="en-US"/>
+        </w:rPr>
+        <w:t>logfc.threshold</w:t>
+      </w:r>
+      <w:proofErr w:type="spellEnd"/>
+      <w:r>
+        <w:rPr>
+          <w:lang w:val="en-US"/>
+        </w:rPr>
+        <w:t xml:space="preserve"> = 0.25). The top 5 marker genes per cluster were ranked by average log2 fold-change (avg_log2FC).</w:t>
       </w:r>
     </w:p>
     <w:p>
@@ -1259,48 +1664,90 @@
         <w:rPr>
           <w:lang w:val="en-US"/>
         </w:rPr>
-        <w:t>Harmony Integration</w:t>
-      </w:r>
-    </w:p>
-    <w:p>
-      <w:pPr>
-        <w:rPr>
-          <w:lang w:val="en-US"/>
-        </w:rPr>
-      </w:pPr>
-      <w:r>
-        <w:rPr>
-          <w:lang w:val="en-US"/>
-        </w:rPr>
-        <w:t>To mitigate sample-specific batch effects across the five metastasis specimens, batch correction was executed on the top 30 principal components using the Harmony algorithm (</w:t>
-      </w:r>
-      <w:proofErr w:type="spellStart"/>
-      <w:r>
-        <w:rPr>
-          <w:lang w:val="en-US"/>
-        </w:rPr>
-        <w:t>RunHarmony</w:t>
-      </w:r>
-      <w:proofErr w:type="spellEnd"/>
-      <w:r>
-        <w:rPr>
-          <w:lang w:val="en-US"/>
-        </w:rPr>
-        <w:t>) with sample identity (</w:t>
-      </w:r>
-      <w:proofErr w:type="spellStart"/>
-      <w:r>
-        <w:rPr>
-          <w:lang w:val="en-US"/>
-        </w:rPr>
-        <w:t>orig.ident</w:t>
-      </w:r>
-      <w:proofErr w:type="spellEnd"/>
-      <w:r>
-        <w:rPr>
-          <w:lang w:val="en-US"/>
-        </w:rPr>
-        <w:t>) set as the batch variable and a diversity penalty parameter (theta = 4). Harmony embeddings (harmony) were generated for downstream dimensional reduction and graph-based clustering.</w:t>
+        <w:t>Identification and Sub-clustering of Myeloid Cells</w:t>
+      </w:r>
+    </w:p>
+    <w:p>
+      <w:pPr>
+        <w:rPr>
+          <w:lang w:val="en-US"/>
+        </w:rPr>
+      </w:pPr>
+      <w:r>
+        <w:rPr>
+          <w:lang w:val="en-US"/>
+        </w:rPr>
+        <w:t xml:space="preserve">The myeloid cell population was identified by evaluating average cluster-level expression of canonical myeloid markers (TREM2, C1QB, GPR34, FOLR2, and C1QC) using </w:t>
+      </w:r>
+      <w:proofErr w:type="spellStart"/>
+      <w:r>
+        <w:rPr>
+          <w:lang w:val="en-US"/>
+        </w:rPr>
+        <w:t>AverageExpression</w:t>
+      </w:r>
+      <w:proofErr w:type="spellEnd"/>
+      <w:r>
+        <w:rPr>
+          <w:lang w:val="en-US"/>
+        </w:rPr>
+        <w:t>. Cells belonging to the primary myeloid cluster (Cluster 0) were isolated and re-processed. Highly variable features (top 2,000 genes) were re-selected, scaled, and subjected to PCA. Harmony batch integration was re-applied across the top 20 principal components (</w:t>
+      </w:r>
+      <w:proofErr w:type="spellStart"/>
+      <w:r>
+        <w:rPr>
+          <w:lang w:val="en-US"/>
+        </w:rPr>
+        <w:t>dims.use</w:t>
+      </w:r>
+      <w:proofErr w:type="spellEnd"/>
+      <w:r>
+        <w:rPr>
+          <w:lang w:val="en-US"/>
+        </w:rPr>
+        <w:t xml:space="preserve"> = 1:20, theta = 4). Sub-clustering was performed at a resolution of 0.5 on the Harmony neighborhood graph, followed by UMAP projection (</w:t>
+      </w:r>
+      <w:proofErr w:type="spellStart"/>
+      <w:r>
+        <w:rPr>
+          <w:lang w:val="en-US"/>
+        </w:rPr>
+        <w:t>RunUMAP</w:t>
+      </w:r>
+      <w:proofErr w:type="spellEnd"/>
+      <w:r>
+        <w:rPr>
+          <w:lang w:val="en-US"/>
+        </w:rPr>
+        <w:t xml:space="preserve">). Sub-cluster-specific marker genes were identified via </w:t>
+      </w:r>
+      <w:proofErr w:type="spellStart"/>
+      <w:r>
+        <w:rPr>
+          <w:lang w:val="en-US"/>
+        </w:rPr>
+        <w:t>FindAllMarkers</w:t>
+      </w:r>
+      <w:proofErr w:type="spellEnd"/>
+      <w:r>
+        <w:rPr>
+          <w:lang w:val="en-US"/>
+        </w:rPr>
+        <w:t>, and canonical lineages/states were validated using feature expression plots (</w:t>
+      </w:r>
+      <w:proofErr w:type="spellStart"/>
+      <w:r>
+        <w:rPr>
+          <w:lang w:val="en-US"/>
+        </w:rPr>
+        <w:t>FeaturePlot</w:t>
+      </w:r>
+      <w:proofErr w:type="spellEnd"/>
+      <w:r>
+        <w:rPr>
+          <w:lang w:val="en-US"/>
+        </w:rPr>
+        <w:t>) for myeloid lineage.</w:t>
       </w:r>
     </w:p>
     <w:p>
@@ -1314,60 +1761,118 @@
         <w:rPr>
           <w:lang w:val="en-US"/>
         </w:rPr>
-        <w:t>Clustering</w:t>
-      </w:r>
-    </w:p>
-    <w:p>
-      <w:pPr>
-        <w:rPr>
-          <w:lang w:val="en-US"/>
-        </w:rPr>
-      </w:pPr>
-      <w:r>
-        <w:rPr>
-          <w:lang w:val="en-US"/>
-        </w:rPr>
-        <w:t xml:space="preserve">Graph-based unsupervised clustering was performed before and after Harmony batch correction for comparison. Cell-cell similarity graphs were constructed using </w:t>
-      </w:r>
-      <w:proofErr w:type="spellStart"/>
-      <w:r>
-        <w:rPr>
-          <w:lang w:val="en-US"/>
-        </w:rPr>
-        <w:t>FindNeighbors</w:t>
-      </w:r>
-      <w:proofErr w:type="spellEnd"/>
-      <w:r>
-        <w:rPr>
-          <w:lang w:val="en-US"/>
-        </w:rPr>
-        <w:t xml:space="preserve"> based on either the first 30 uncorrected principal components or the first 30 Harmony-integrated dimensions. </w:t>
-      </w:r>
-      <w:r>
-        <w:rPr>
-          <w:lang w:val="en-US"/>
-        </w:rPr>
-        <w:t>We then performed community detection with</w:t>
-      </w:r>
-      <w:r>
-        <w:rPr>
-          <w:lang w:val="en-US"/>
-        </w:rPr>
-        <w:t xml:space="preserve"> </w:t>
-      </w:r>
-      <w:proofErr w:type="spellStart"/>
-      <w:r>
-        <w:rPr>
-          <w:lang w:val="en-US"/>
-        </w:rPr>
-        <w:t>FindClusters</w:t>
-      </w:r>
-      <w:proofErr w:type="spellEnd"/>
-      <w:r>
-        <w:rPr>
-          <w:lang w:val="en-US"/>
-        </w:rPr>
-        <w:t xml:space="preserve"> at a modularity resolution of 0.5.</w:t>
+        <w:t>Automated Annotation of the defined clusters</w:t>
+      </w:r>
+    </w:p>
+    <w:p>
+      <w:pPr>
+        <w:rPr>
+          <w:lang w:val="en-US"/>
+        </w:rPr>
+      </w:pPr>
+      <w:r>
+        <w:rPr>
+          <w:lang w:val="en-US"/>
+        </w:rPr>
+        <w:t xml:space="preserve">Automated cell-type annotation of the single-cell transcriptomic dataset was performed using the </w:t>
+      </w:r>
+      <w:proofErr w:type="spellStart"/>
+      <w:r>
+        <w:rPr>
+          <w:lang w:val="en-US"/>
+        </w:rPr>
+        <w:t>SingleR</w:t>
+      </w:r>
+      <w:proofErr w:type="spellEnd"/>
+      <w:r>
+        <w:rPr>
+          <w:lang w:val="en-US"/>
+        </w:rPr>
+        <w:t xml:space="preserve"> package. The Seurat object was converted into a </w:t>
+      </w:r>
+      <w:proofErr w:type="spellStart"/>
+      <w:r>
+        <w:rPr>
+          <w:lang w:val="en-US"/>
+        </w:rPr>
+        <w:t>SingleCellExperiment</w:t>
+      </w:r>
+      <w:proofErr w:type="spellEnd"/>
+      <w:r>
+        <w:rPr>
+          <w:lang w:val="en-US"/>
+        </w:rPr>
+        <w:t xml:space="preserve"> object and queried against two reference datasets from the </w:t>
+      </w:r>
+      <w:proofErr w:type="spellStart"/>
+      <w:r>
+        <w:rPr>
+          <w:lang w:val="en-US"/>
+        </w:rPr>
+        <w:t>celldex</w:t>
+      </w:r>
+      <w:proofErr w:type="spellEnd"/>
+      <w:r>
+        <w:rPr>
+          <w:lang w:val="en-US"/>
+        </w:rPr>
+        <w:t xml:space="preserve"> package: the Human Primary Cell Atlas Data (</w:t>
+      </w:r>
+      <w:proofErr w:type="spellStart"/>
+      <w:r>
+        <w:rPr>
+          <w:lang w:val="en-US"/>
+        </w:rPr>
+        <w:t>HumanPrimaryCellAtlasData</w:t>
+      </w:r>
+      <w:proofErr w:type="spellEnd"/>
+      <w:r>
+        <w:rPr>
+          <w:lang w:val="en-US"/>
+        </w:rPr>
+        <w:t>) and the Monaco Immune Data (</w:t>
+      </w:r>
+      <w:proofErr w:type="spellStart"/>
+      <w:r>
+        <w:rPr>
+          <w:lang w:val="en-US"/>
+        </w:rPr>
+        <w:t>MonacoImmuneData</w:t>
+      </w:r>
+      <w:proofErr w:type="spellEnd"/>
+      <w:r>
+        <w:rPr>
+          <w:lang w:val="en-US"/>
+        </w:rPr>
+        <w:t>). Main cell-type labels (</w:t>
+      </w:r>
+      <w:proofErr w:type="spellStart"/>
+      <w:r>
+        <w:rPr>
+          <w:lang w:val="en-US"/>
+        </w:rPr>
+        <w:t>label.main</w:t>
+      </w:r>
+      <w:proofErr w:type="spellEnd"/>
+      <w:r>
+        <w:rPr>
+          <w:lang w:val="en-US"/>
+        </w:rPr>
+        <w:t xml:space="preserve">) from both references were utilized simultaneously to assign predictions to individual cells. The resulting predicted labels were added back to the Seurat object metadata and visualized using Uniform Manifold Approximation and Projection (UMAP) dimensionality reduction plots generated via </w:t>
+      </w:r>
+      <w:proofErr w:type="spellStart"/>
+      <w:r>
+        <w:rPr>
+          <w:lang w:val="en-US"/>
+        </w:rPr>
+        <w:t>DimPlot</w:t>
+      </w:r>
+      <w:proofErr w:type="spellEnd"/>
+      <w:r>
+        <w:rPr>
+          <w:lang w:val="en-US"/>
+        </w:rPr>
+        <w:t>.</w:t>
       </w:r>
     </w:p>
     <w:p>
@@ -1381,76 +1886,131 @@
         <w:rPr>
           <w:lang w:val="en-US"/>
         </w:rPr>
-        <w:t>Clusters Visualization (UMAP and t-SNE)</w:t>
-      </w:r>
-    </w:p>
-    <w:p>
-      <w:pPr>
-        <w:rPr>
-          <w:lang w:val="en-US"/>
-        </w:rPr>
-      </w:pPr>
-      <w:r>
-        <w:rPr>
-          <w:lang w:val="en-US"/>
-        </w:rPr>
-        <w:t>For non-linear dimensional reduction and spatial visualization, Uniform Manifold Approximation and Projection (UMAP) embeddings were generated before (</w:t>
-      </w:r>
-      <w:proofErr w:type="spellStart"/>
-      <w:r>
-        <w:rPr>
-          <w:lang w:val="en-US"/>
-        </w:rPr>
-        <w:t>umap_pca</w:t>
-      </w:r>
-      <w:proofErr w:type="spellEnd"/>
-      <w:r>
-        <w:rPr>
-          <w:lang w:val="en-US"/>
-        </w:rPr>
-        <w:t>) and after batch correction (</w:t>
-      </w:r>
-      <w:proofErr w:type="spellStart"/>
-      <w:r>
-        <w:rPr>
-          <w:lang w:val="en-US"/>
-        </w:rPr>
-        <w:t>umap</w:t>
-      </w:r>
-      <w:proofErr w:type="spellEnd"/>
-      <w:r>
-        <w:rPr>
-          <w:lang w:val="en-US"/>
-        </w:rPr>
-        <w:t>) using the first 30 dimensions. In addition, t-Distributed Stochastic Neighbor Embedding (t-SNE) was performed on the 30 Harmony dimensions (</w:t>
-      </w:r>
-      <w:proofErr w:type="spellStart"/>
-      <w:r>
-        <w:rPr>
-          <w:lang w:val="en-US"/>
-        </w:rPr>
-        <w:t>RunTSNE</w:t>
-      </w:r>
-      <w:proofErr w:type="spellEnd"/>
-      <w:r>
-        <w:rPr>
-          <w:lang w:val="en-US"/>
-        </w:rPr>
-        <w:t>, reduction.name = "</w:t>
-      </w:r>
-      <w:proofErr w:type="spellStart"/>
-      <w:r>
-        <w:rPr>
-          <w:lang w:val="en-US"/>
-        </w:rPr>
-        <w:t>tsne_harmony</w:t>
-      </w:r>
-      <w:proofErr w:type="spellEnd"/>
-      <w:r>
-        <w:rPr>
-          <w:lang w:val="en-US"/>
-        </w:rPr>
-        <w:t>"). Cluster distributions and batch mixing across individual samples were evaluated on UMAP and t-SNE projections.</w:t>
+        <w:t>Differential expression annotation of the defined clusters</w:t>
+      </w:r>
+    </w:p>
+    <w:p>
+      <w:pPr>
+        <w:rPr>
+          <w:lang w:val="en-US"/>
+        </w:rPr>
+      </w:pPr>
+      <w:r>
+        <w:rPr>
+          <w:lang w:val="en-US"/>
+        </w:rPr>
+        <w:t xml:space="preserve">To biologically annotate and refine the unsupervised clusters, marker genes for each cluster were identified using Seurat's </w:t>
+      </w:r>
+      <w:proofErr w:type="spellStart"/>
+      <w:r>
+        <w:rPr>
+          <w:lang w:val="en-US"/>
+        </w:rPr>
+        <w:t>FindAllMarkers</w:t>
+      </w:r>
+      <w:proofErr w:type="spellEnd"/>
+      <w:r>
+        <w:rPr>
+          <w:lang w:val="en-US"/>
+        </w:rPr>
+        <w:t xml:space="preserve"> function, restricting evaluation to upregulated genes (</w:t>
+      </w:r>
+      <w:proofErr w:type="spellStart"/>
+      <w:r>
+        <w:rPr>
+          <w:lang w:val="en-US"/>
+        </w:rPr>
+        <w:t>only.pos</w:t>
+      </w:r>
+      <w:proofErr w:type="spellEnd"/>
+      <w:r>
+        <w:rPr>
+          <w:lang w:val="en-US"/>
+        </w:rPr>
+        <w:t xml:space="preserve"> = TRUE) with a minimum expression fraction threshold (min.pct = 0.25) and a log2 fold-change threshold (</w:t>
+      </w:r>
+      <w:proofErr w:type="spellStart"/>
+      <w:r>
+        <w:rPr>
+          <w:lang w:val="en-US"/>
+        </w:rPr>
+        <w:t>logfc.threshold</w:t>
+      </w:r>
+      <w:proofErr w:type="spellEnd"/>
+      <w:r>
+        <w:rPr>
+          <w:lang w:val="en-US"/>
+        </w:rPr>
+        <w:t xml:space="preserve"> = 0.25). The top 25 marker genes per cluster based on average log2 fold-change (avg_log2FC) were extracted and saved. Clusters 0 through 14 were manually annotated into broad lineages and tumor states based on marker expression signatures.  Identified cell types were assigned to active cluster identities and visualized on UMAP plots.</w:t>
+      </w:r>
+    </w:p>
+    <w:p>
+      <w:pPr>
+        <w:pStyle w:val="Heading3"/>
+        <w:rPr>
+          <w:lang w:val="en-US"/>
+        </w:rPr>
+      </w:pPr>
+      <w:r>
+        <w:rPr>
+          <w:lang w:val="en-US"/>
+        </w:rPr>
+        <w:t>A heatmap as QC to Check for NAs</w:t>
+      </w:r>
+    </w:p>
+    <w:p>
+      <w:pPr>
+        <w:rPr>
+          <w:lang w:val="en-US"/>
+        </w:rPr>
+      </w:pPr>
+      <w:r>
+        <w:rPr>
+          <w:lang w:val="en-US"/>
+        </w:rPr>
+        <w:t>Prior to expression visualization, quality control checks were conducted on the cell type metadata (</w:t>
+      </w:r>
+      <w:proofErr w:type="spellStart"/>
+      <w:r>
+        <w:rPr>
+          <w:lang w:val="en-US"/>
+        </w:rPr>
+        <w:t>cell_type</w:t>
+      </w:r>
+      <w:proofErr w:type="spellEnd"/>
+      <w:r>
+        <w:rPr>
+          <w:lang w:val="en-US"/>
+        </w:rPr>
+        <w:t>) to verify data integrity and confirm the absence of missing values (NA). Cells with valid annotations were retained, and expression patterns of selected marker genes (</w:t>
+      </w:r>
+      <w:proofErr w:type="spellStart"/>
+      <w:r>
+        <w:rPr>
+          <w:lang w:val="en-US"/>
+        </w:rPr>
+        <w:t>genes_to_plot</w:t>
+      </w:r>
+      <w:proofErr w:type="spellEnd"/>
+      <w:r>
+        <w:rPr>
+          <w:lang w:val="en-US"/>
+        </w:rPr>
+        <w:t xml:space="preserve">) across cell-type identities were visualized using Seurat's </w:t>
+      </w:r>
+      <w:proofErr w:type="spellStart"/>
+      <w:r>
+        <w:rPr>
+          <w:lang w:val="en-US"/>
+        </w:rPr>
+        <w:t>DoHeatmap</w:t>
+      </w:r>
+      <w:proofErr w:type="spellEnd"/>
+      <w:r>
+        <w:rPr>
+          <w:lang w:val="en-US"/>
+        </w:rPr>
+        <w:t>. Gene expression values were scaled and displayed using a custom color gradient.</w:t>
       </w:r>
     </w:p>
     <w:p>
@@ -1464,62 +2024,41 @@
         <w:rPr>
           <w:lang w:val="en-US"/>
         </w:rPr>
-        <w:t>Identification of Clusters Marker Genes</w:t>
-      </w:r>
-    </w:p>
-    <w:p>
-      <w:pPr>
-        <w:rPr>
-          <w:lang w:val="en-US"/>
-        </w:rPr>
-      </w:pPr>
-      <w:r>
-        <w:rPr>
-          <w:lang w:val="en-US"/>
-        </w:rPr>
-        <w:t xml:space="preserve">Differentially expressed gene (DEG) markers defining each integrated cluster were identified using Seurat's </w:t>
-      </w:r>
-      <w:proofErr w:type="spellStart"/>
-      <w:r>
-        <w:rPr>
-          <w:lang w:val="en-US"/>
-        </w:rPr>
-        <w:t>FindAllMarkers</w:t>
-      </w:r>
-      <w:proofErr w:type="spellEnd"/>
-      <w:r>
-        <w:rPr>
-          <w:lang w:val="en-US"/>
-        </w:rPr>
-        <w:t xml:space="preserve"> function. Non-parametric Wilcoxon rank-sum tests were conducted evaluating positively expressed genes (</w:t>
-      </w:r>
-      <w:proofErr w:type="spellStart"/>
-      <w:r>
-        <w:rPr>
-          <w:lang w:val="en-US"/>
-        </w:rPr>
-        <w:t>only.pos</w:t>
-      </w:r>
-      <w:proofErr w:type="spellEnd"/>
-      <w:r>
-        <w:rPr>
-          <w:lang w:val="en-US"/>
-        </w:rPr>
-        <w:t xml:space="preserve"> = TRUE) detected in a minimum fraction of 25% of cells in either comparison group (min.pct = 0.25) with a natural log fold-change threshold of at least 0.25 (</w:t>
-      </w:r>
-      <w:proofErr w:type="spellStart"/>
-      <w:r>
-        <w:rPr>
-          <w:lang w:val="en-US"/>
-        </w:rPr>
-        <w:t>logfc.threshold</w:t>
-      </w:r>
-      <w:proofErr w:type="spellEnd"/>
-      <w:r>
-        <w:rPr>
-          <w:lang w:val="en-US"/>
-        </w:rPr>
-        <w:t xml:space="preserve"> = 0.25). The top 5 marker genes per cluster were ranked by average log2 fold-change (avg_log2FC).</w:t>
+        <w:t>Differential expression annotation of the Myeloid sub-clusters</w:t>
+      </w:r>
+    </w:p>
+    <w:p>
+      <w:pPr>
+        <w:rPr>
+          <w:lang w:val="en-US"/>
+        </w:rPr>
+      </w:pPr>
+      <w:r>
+        <w:rPr>
+          <w:lang w:val="en-US"/>
+        </w:rPr>
+        <w:t>Sub-clustering analysis was focused on the myeloid lineage. Differential expression analysis was performed on the myeloid sub-clusters, and significant markers (</w:t>
+      </w:r>
+      <w:proofErr w:type="spellStart"/>
+      <w:r>
+        <w:rPr>
+          <w:lang w:val="en-US"/>
+        </w:rPr>
+        <w:t>padj</w:t>
+      </w:r>
+      <w:proofErr w:type="spellEnd"/>
+      <w:r>
+        <w:rPr>
+          <w:lang w:val="en-US"/>
+        </w:rPr>
+        <w:t xml:space="preserve"> &lt; 0.05) were filtered. The top </w:t>
+      </w:r>
+      <w:r>
+        <w:rPr>
+          <w:lang w:val="en-US"/>
+        </w:rPr>
+        <w:lastRenderedPageBreak/>
+        <w:t>25 markers per sub-cluster ranked by avg_log2FC were exported (top25_myeloid_markers.csv), followed by UMAP visualization.</w:t>
       </w:r>
     </w:p>
     <w:p>
@@ -1533,98 +2072,537 @@
         <w:rPr>
           <w:lang w:val="en-US"/>
         </w:rPr>
-        <w:t>Identification and Sub-clustering of Myeloid Cells</w:t>
-      </w:r>
-    </w:p>
-    <w:p>
-      <w:pPr>
-        <w:rPr>
-          <w:lang w:val="en-US"/>
-        </w:rPr>
-      </w:pPr>
-      <w:r>
-        <w:rPr>
-          <w:lang w:val="en-US"/>
-        </w:rPr>
-        <w:t xml:space="preserve">The myeloid cell population was identified by evaluating average cluster-level expression of canonical myeloid markers (TREM2, C1QB, GPR34, FOLR2, and C1QC) using </w:t>
-      </w:r>
-      <w:proofErr w:type="spellStart"/>
-      <w:r>
-        <w:rPr>
-          <w:lang w:val="en-US"/>
-        </w:rPr>
-        <w:t>AverageExpression</w:t>
-      </w:r>
-      <w:proofErr w:type="spellEnd"/>
-      <w:r>
-        <w:rPr>
-          <w:lang w:val="en-US"/>
-        </w:rPr>
-        <w:t>. Cells belonging to the primary myeloid cluster (Cluster 0) were isolated and re-processed. Highly variable features (top 2,000 genes) were re-selected, scaled, and subjected to PCA. Harmony batch integration was re-applied across the top 20 principal components (</w:t>
-      </w:r>
-      <w:proofErr w:type="spellStart"/>
-      <w:r>
-        <w:rPr>
-          <w:lang w:val="en-US"/>
-        </w:rPr>
-        <w:t>dims.use</w:t>
-      </w:r>
-      <w:proofErr w:type="spellEnd"/>
-      <w:r>
-        <w:rPr>
-          <w:lang w:val="en-US"/>
-        </w:rPr>
-        <w:t xml:space="preserve"> = 1:20, theta = 4). </w:t>
-      </w:r>
+        <w:t>Determining of M1 and M2 states</w:t>
+      </w:r>
+    </w:p>
+    <w:p>
+      <w:pPr>
+        <w:rPr>
+          <w:lang w:val="en-US"/>
+        </w:rPr>
+      </w:pPr>
+      <w:r>
+        <w:rPr>
+          <w:lang w:val="en-US"/>
+        </w:rPr>
+        <w:t xml:space="preserve">To characterize functional polarization states within the myeloid population, module scores for canonical M1 (pro-inflammatory) and M2 (anti-inflammatory/immunosuppressive) gene sets were calculated using Seurat's </w:t>
+      </w:r>
+      <w:proofErr w:type="spellStart"/>
+      <w:r>
+        <w:rPr>
+          <w:lang w:val="en-US"/>
+        </w:rPr>
+        <w:t>AddModuleScore</w:t>
+      </w:r>
+      <w:proofErr w:type="spellEnd"/>
+      <w:r>
+        <w:rPr>
+          <w:lang w:val="en-US"/>
+        </w:rPr>
+        <w:t xml:space="preserve"> function. Module scores were evaluated across myeloid sub-clusters via violin plots (</w:t>
+      </w:r>
+      <w:proofErr w:type="spellStart"/>
+      <w:r>
+        <w:rPr>
+          <w:lang w:val="en-US"/>
+        </w:rPr>
+        <w:t>VlnPlot</w:t>
+      </w:r>
+      <w:proofErr w:type="spellEnd"/>
+      <w:r>
+        <w:rPr>
+          <w:lang w:val="en-US"/>
+        </w:rPr>
+        <w:t>), and mean scores as well as score differentials (M1 - M2) were calculated for each sub-cluster.</w:t>
+      </w:r>
+    </w:p>
+    <w:p>
+      <w:pPr>
+        <w:pStyle w:val="Heading3"/>
+        <w:rPr>
+          <w:lang w:val="en-US"/>
+        </w:rPr>
+      </w:pPr>
+      <w:r>
+        <w:rPr>
+          <w:lang w:val="en-US"/>
+        </w:rPr>
+        <w:t>Annotation of M1 and M2 states</w:t>
+      </w:r>
+    </w:p>
+    <w:p>
+      <w:pPr>
+        <w:rPr>
+          <w:lang w:val="en-US"/>
+        </w:rPr>
+      </w:pPr>
+      <w:r>
+        <w:rPr>
+          <w:lang w:val="en-US"/>
+        </w:rPr>
+        <w:t xml:space="preserve">Myeloid sub-clusters were consolidated into broader lineages, merging cluster 0 and 1 into "Macrophage" while maintaining "Microglia" and other non-macrophage/microglia populations. A net polarization score was calculated for each cell as Delta S = {M1_score1} - {M2_score1}. </w:t>
+      </w:r>
+    </w:p>
+    <w:p>
+      <w:pPr>
+        <w:rPr>
+          <w:lang w:val="en-US"/>
+        </w:rPr>
+      </w:pPr>
+      <w:r>
+        <w:rPr>
+          <w:lang w:val="en-US"/>
+        </w:rPr>
+        <w:t>Polarization states were categorized based on a threshold (= 0.1): cells with Delta S &gt; 0.1 were assigned as "M1-like", cells with Delta S &lt; -0.1 as "M2-like", and cells falling between (-0.1 and 0.1) as "Intermediate". For Macrophage and Microglia lineages, composite annotations combining cell identity and polarization state (e.g., "Macrophage_M1-like") were assigned and visualized using UMAP projections.</w:t>
+      </w:r>
+    </w:p>
+    <w:p>
+      <w:pPr>
+        <w:pStyle w:val="Heading3"/>
+        <w:rPr>
+          <w:lang w:val="en-US"/>
+        </w:rPr>
+      </w:pPr>
+      <w:r>
+        <w:rPr>
+          <w:lang w:val="en-US"/>
+        </w:rPr>
+        <w:t>Visualizations of M1 and M2 states</w:t>
+      </w:r>
+    </w:p>
+    <w:p>
+      <w:pPr>
+        <w:rPr>
+          <w:lang w:val="en-US"/>
+        </w:rPr>
+      </w:pPr>
+      <w:r>
+        <w:rPr>
+          <w:lang w:val="en-US"/>
+        </w:rPr>
+        <w:t xml:space="preserve">Polarization dynamics and cell-state distributions were visualized through multiple complementary approaches: (1) UMAP projections of cell types split by polarization state (M1-like, M2-like, Intermediate); (2) UMAP feature plots displaying continuous Delta S values using a divergent color gradient (blue for M1-leaning, red for M2-leaning); (3) stacked bar charts (ggplot2) displaying the relative percentage distribution of M1-like, M2-like, and Intermediate states strictly within Macrophage and Microglia populations; and (4) sub-cluster UMAP feature maps paired with top marker heatmaps (top 5 markers per cluster, </w:t>
+      </w:r>
+      <w:proofErr w:type="spellStart"/>
+      <w:r>
+        <w:rPr>
+          <w:lang w:val="en-US"/>
+        </w:rPr>
+        <w:t>padj</w:t>
+      </w:r>
+      <w:proofErr w:type="spellEnd"/>
+      <w:r>
+        <w:rPr>
+          <w:lang w:val="en-US"/>
+        </w:rPr>
+        <w:t xml:space="preserve"> &lt; 0.05).</w:t>
+      </w:r>
+    </w:p>
+    <w:p>
+      <w:pPr>
+        <w:pStyle w:val="Heading2"/>
+        <w:rPr>
+          <w:lang w:val="en-US"/>
+        </w:rPr>
+      </w:pPr>
+      <w:r>
+        <w:rPr>
+          <w:lang w:val="en-US"/>
+        </w:rPr>
+        <w:t>Differential Expression Analysis and Volcano Plot Visualization</w:t>
+      </w:r>
+    </w:p>
+    <w:p>
+      <w:pPr>
+        <w:rPr>
+          <w:lang w:val="en-US"/>
+        </w:rPr>
+      </w:pPr>
+      <w:r>
+        <w:rPr>
+          <w:lang w:val="en-US"/>
+        </w:rPr>
+        <w:t xml:space="preserve">Differential expression analysis was performed using a two-sided Wilcoxon rank-sum test via the </w:t>
+      </w:r>
+      <w:proofErr w:type="spellStart"/>
+      <w:r>
+        <w:rPr>
+          <w:lang w:val="en-US"/>
+        </w:rPr>
+        <w:t>FindMarkers</w:t>
+      </w:r>
+      <w:proofErr w:type="spellEnd"/>
+      <w:r>
+        <w:rPr>
+          <w:lang w:val="en-US"/>
+        </w:rPr>
+        <w:t xml:space="preserve"> function in Seurat with a minimum cell fraction detection threshold (min.pct) of 0.1 and an absolute log2 fold-change threshold of 0. Differential expression results were categorized into significance tiers based on adjusted p-values calculated using the Benjamini-Hochberg false discovery rate (FDR) correction: highly significant (FDR &lt; 0.01 and log_2FC &gt; 1), significant (FDR &lt; 0.05), or non-significant. Volcano plots were constructed using ggplot2 and </w:t>
+      </w:r>
+      <w:proofErr w:type="spellStart"/>
+      <w:r>
+        <w:rPr>
+          <w:lang w:val="en-US"/>
+        </w:rPr>
+        <w:t>ggrepel</w:t>
+      </w:r>
+      <w:proofErr w:type="spellEnd"/>
+      <w:r>
+        <w:rPr>
+          <w:lang w:val="en-US"/>
+        </w:rPr>
+        <w:t xml:space="preserve">. To prevent visual distortion from extreme </w:t>
+      </w:r>
+      <w:proofErr w:type="spellStart"/>
+      <w:r>
+        <w:rPr>
+          <w:lang w:val="en-US"/>
+        </w:rPr>
+        <w:t>pvalues</w:t>
+      </w:r>
+      <w:proofErr w:type="spellEnd"/>
+      <w:r>
+        <w:rPr>
+          <w:lang w:val="en-US"/>
+        </w:rPr>
+        <w:t xml:space="preserve">, -log10pvalues were capped at 300. For representative gene annotation, the top 12 upregulated and downregulated genes per contrast were selected based on adjusted </w:t>
+      </w:r>
+      <w:proofErr w:type="spellStart"/>
+      <w:r>
+        <w:rPr>
+          <w:lang w:val="en-US"/>
+        </w:rPr>
+        <w:t>pvalue</w:t>
+      </w:r>
+      <w:proofErr w:type="spellEnd"/>
+      <w:r>
+        <w:rPr>
+          <w:lang w:val="en-US"/>
+        </w:rPr>
+        <w:t xml:space="preserve"> and log2 fold-change filtering, excluding lowly expressed outliers (cell fraction &lt; 0.1) and extreme fold-change fluctuations (log_2FC &gt; 6).</w:t>
+      </w:r>
+    </w:p>
+    <w:p>
+      <w:pPr>
+        <w:pStyle w:val="Heading2"/>
+        <w:rPr>
+          <w:lang w:val="en-US"/>
+        </w:rPr>
+      </w:pPr>
       <w:r>
         <w:rPr>
           <w:lang w:val="en-US"/>
         </w:rPr>
         <w:lastRenderedPageBreak/>
-        <w:t>Sub-clustering was performed at a resolution of 0.5 on the Harmony neighborhood graph, followed by UMAP projection (</w:t>
-      </w:r>
-      <w:proofErr w:type="spellStart"/>
-      <w:r>
-        <w:rPr>
-          <w:lang w:val="en-US"/>
-        </w:rPr>
-        <w:t>RunUMAP</w:t>
-      </w:r>
-      <w:proofErr w:type="spellEnd"/>
-      <w:r>
-        <w:rPr>
-          <w:lang w:val="en-US"/>
-        </w:rPr>
-        <w:t xml:space="preserve">). Sub-cluster-specific marker genes were identified via </w:t>
-      </w:r>
-      <w:proofErr w:type="spellStart"/>
-      <w:r>
-        <w:rPr>
-          <w:lang w:val="en-US"/>
-        </w:rPr>
-        <w:t>FindAllMarkers</w:t>
-      </w:r>
-      <w:proofErr w:type="spellEnd"/>
-      <w:r>
-        <w:rPr>
-          <w:lang w:val="en-US"/>
-        </w:rPr>
-        <w:t>, and canonical lineages/states were validated using feature expression plots (</w:t>
-      </w:r>
-      <w:proofErr w:type="spellStart"/>
-      <w:r>
-        <w:rPr>
-          <w:lang w:val="en-US"/>
-        </w:rPr>
-        <w:t>FeaturePlot</w:t>
-      </w:r>
-      <w:proofErr w:type="spellEnd"/>
-      <w:r>
-        <w:rPr>
-          <w:lang w:val="en-US"/>
-        </w:rPr>
-        <w:t>) for myeloid lineage.</w:t>
-      </w:r>
+        <w:t xml:space="preserve">Functional Enrichment Analysis (GO, KEGG, </w:t>
+      </w:r>
+      <w:proofErr w:type="spellStart"/>
+      <w:r>
+        <w:rPr>
+          <w:lang w:val="en-US"/>
+        </w:rPr>
+        <w:t>Reactome</w:t>
+      </w:r>
+      <w:proofErr w:type="spellEnd"/>
+      <w:r>
+        <w:rPr>
+          <w:lang w:val="en-US"/>
+        </w:rPr>
+        <w:t>)</w:t>
+      </w:r>
+    </w:p>
+    <w:p>
+      <w:pPr>
+        <w:rPr>
+          <w:lang w:val="en-US"/>
+        </w:rPr>
+      </w:pPr>
+      <w:r>
+        <w:rPr>
+          <w:lang w:val="en-US"/>
+        </w:rPr>
+        <w:t xml:space="preserve">Directional functional enrichment analysis was conducted separately for significantly upregulated (log_2FC &gt; 1, FDR &lt; 0.05) and downregulated (log_2FC &lt; -1, FDR &lt; 0.05) genes. Gene symbols were mapped to Entrez Gene IDs using the </w:t>
+      </w:r>
+      <w:proofErr w:type="spellStart"/>
+      <w:r>
+        <w:rPr>
+          <w:lang w:val="en-US"/>
+        </w:rPr>
+        <w:t>org.Hs.eg.db</w:t>
+      </w:r>
+      <w:proofErr w:type="spellEnd"/>
+      <w:r>
+        <w:rPr>
+          <w:lang w:val="en-US"/>
+        </w:rPr>
+        <w:t xml:space="preserve"> R package via </w:t>
+      </w:r>
+      <w:proofErr w:type="spellStart"/>
+      <w:r>
+        <w:rPr>
+          <w:lang w:val="en-US"/>
+        </w:rPr>
+        <w:t>clusterProfiler</w:t>
+      </w:r>
+      <w:proofErr w:type="spellEnd"/>
+      <w:r>
+        <w:rPr>
+          <w:lang w:val="en-US"/>
+        </w:rPr>
+        <w:t>::</w:t>
+      </w:r>
+      <w:proofErr w:type="spellStart"/>
+      <w:r>
+        <w:rPr>
+          <w:lang w:val="en-US"/>
+        </w:rPr>
+        <w:t>bitr</w:t>
+      </w:r>
+      <w:proofErr w:type="spellEnd"/>
+      <w:r>
+        <w:rPr>
+          <w:lang w:val="en-US"/>
+        </w:rPr>
+        <w:t xml:space="preserve">. </w:t>
+      </w:r>
+    </w:p>
+    <w:p>
+      <w:pPr>
+        <w:rPr>
+          <w:lang w:val="en-US"/>
+        </w:rPr>
+      </w:pPr>
+      <w:r>
+        <w:rPr>
+          <w:lang w:val="en-US"/>
+        </w:rPr>
+        <w:t xml:space="preserve">Over-representation analysis (ORA) was executed across Gene Ontology (GO) categories—Biological Process (BP), Molecular Function (MF), and Cellular Component (CC), as well as Kyoto Encyclopedia of Genes and Genomes (KEGG) pathways using </w:t>
+      </w:r>
+      <w:proofErr w:type="spellStart"/>
+      <w:r>
+        <w:rPr>
+          <w:lang w:val="en-US"/>
+        </w:rPr>
+        <w:t>clusterProfiler</w:t>
+      </w:r>
+      <w:proofErr w:type="spellEnd"/>
+      <w:r>
+        <w:rPr>
+          <w:lang w:val="en-US"/>
+        </w:rPr>
+        <w:t xml:space="preserve">, and </w:t>
+      </w:r>
+      <w:proofErr w:type="spellStart"/>
+      <w:r>
+        <w:rPr>
+          <w:lang w:val="en-US"/>
+        </w:rPr>
+        <w:t>Reactome</w:t>
+      </w:r>
+      <w:proofErr w:type="spellEnd"/>
+      <w:r>
+        <w:rPr>
+          <w:lang w:val="en-US"/>
+        </w:rPr>
+        <w:t xml:space="preserve"> pathways using </w:t>
+      </w:r>
+      <w:proofErr w:type="spellStart"/>
+      <w:r>
+        <w:rPr>
+          <w:lang w:val="en-US"/>
+        </w:rPr>
+        <w:t>ReactomePA</w:t>
+      </w:r>
+      <w:proofErr w:type="spellEnd"/>
+      <w:r>
+        <w:rPr>
+          <w:lang w:val="en-US"/>
+        </w:rPr>
+        <w:t xml:space="preserve">. Multiple-testing adjustments were performed using the Benjamini-Hochberg method, with terms exhibiting an adjusted </w:t>
+      </w:r>
+      <w:proofErr w:type="spellStart"/>
+      <w:r>
+        <w:rPr>
+          <w:lang w:val="en-US"/>
+        </w:rPr>
+        <w:t>pvalue</w:t>
+      </w:r>
+      <w:proofErr w:type="spellEnd"/>
+      <w:r>
+        <w:rPr>
+          <w:lang w:val="en-US"/>
+        </w:rPr>
+        <w:t xml:space="preserve"> &lt; 0.05 considered statistically enriched.</w:t>
+      </w:r>
+    </w:p>
+    <w:p>
+      <w:pPr>
+        <w:pStyle w:val="Heading3"/>
+        <w:rPr>
+          <w:lang w:val="en-US"/>
+        </w:rPr>
+      </w:pPr>
+      <w:r>
+        <w:rPr>
+          <w:lang w:val="en-US"/>
+        </w:rPr>
+        <w:t>Pathway Enrichment Visualization</w:t>
+      </w:r>
+    </w:p>
+    <w:p>
+      <w:pPr>
+        <w:rPr>
+          <w:lang w:val="en-US"/>
+        </w:rPr>
+      </w:pPr>
+      <w:r>
+        <w:rPr>
+          <w:lang w:val="en-US"/>
+        </w:rPr>
+        <w:t>To facilitate intuitive comparison of biological themes across expression states, enriched functional terms were visualized using bidirectional diverging bar charts in ggplot2. The top 10 most significantly enriched terms (FDR &lt; 0.05) for upregulated and downregulated gene sets were plotted along a continuous normalized axis. Enriched pathways associated with upregulated genes were represented along positive values, whereas downregulated pathways extended along negative values. To handle potential duplicate descriptions across categories, uniquely formatted labels were mapped back to their original term names while preserving factor ordering.</w:t>
+      </w:r>
+    </w:p>
+    <w:p>
+      <w:pPr>
+        <w:pStyle w:val="Heading3"/>
+        <w:rPr>
+          <w:lang w:val="en-US"/>
+        </w:rPr>
+      </w:pPr>
+      <w:r>
+        <w:rPr>
+          <w:lang w:val="en-US"/>
+        </w:rPr>
+        <w:t>Differential Expression and Pathway Enrichment of Fibroblasts</w:t>
+      </w:r>
+    </w:p>
+    <w:p>
+      <w:pPr>
+        <w:rPr>
+          <w:lang w:val="en-US"/>
+        </w:rPr>
+      </w:pPr>
+      <w:r>
+        <w:rPr>
+          <w:lang w:val="en-US"/>
+        </w:rPr>
+        <w:t>Fibroblasts (pericyte/fibroblast cluster 11) were evaluated for differential gene expression against all remaining cell populations in the single-cell dataset using the Wilcoxon rank-sum test. Identified marker genes (FDR &lt; 0.01, log_2FC &gt; 1) were saved, and directional enrichment analysis was performed across REACTOME, KEGG, and GO ontologies (BP, MF, CC). Separate diverging bar plots were generated to visualize enriched biological functions characteristic of the fibroblast population.</w:t>
+      </w:r>
+    </w:p>
+    <w:p>
+      <w:pPr>
+        <w:pStyle w:val="Heading3"/>
+        <w:rPr>
+          <w:lang w:val="en-US"/>
+        </w:rPr>
+      </w:pPr>
+      <w:r>
+        <w:rPr>
+          <w:lang w:val="en-US"/>
+        </w:rPr>
+        <w:t>Differential Expression of M1-like vs. M2-like Macrophages</w:t>
+      </w:r>
+    </w:p>
+    <w:p>
+      <w:pPr>
+        <w:rPr>
+          <w:lang w:val="en-US"/>
+        </w:rPr>
+      </w:pPr>
+      <w:r>
+        <w:rPr>
+          <w:lang w:val="en-US"/>
+        </w:rPr>
+        <w:t xml:space="preserve">Myeloid single-cell clusters were annotated and </w:t>
+      </w:r>
+      <w:proofErr w:type="spellStart"/>
+      <w:r>
+        <w:rPr>
+          <w:lang w:val="en-US"/>
+        </w:rPr>
+        <w:t>subsetted</w:t>
+      </w:r>
+      <w:proofErr w:type="spellEnd"/>
+      <w:r>
+        <w:rPr>
+          <w:lang w:val="en-US"/>
+        </w:rPr>
+        <w:t xml:space="preserve"> to isolate macrophages and microglia. Polarization module scores for M1-like and M2-like transcriptional signatures were computed per cell using </w:t>
+      </w:r>
+      <w:proofErr w:type="spellStart"/>
+      <w:r>
+        <w:rPr>
+          <w:lang w:val="en-US"/>
+        </w:rPr>
+        <w:t>AddModuleScore</w:t>
+      </w:r>
+      <w:proofErr w:type="spellEnd"/>
+      <w:r>
+        <w:rPr>
+          <w:lang w:val="en-US"/>
+        </w:rPr>
+        <w:t>. Individual cells were categorized into polarization states based on the score differential (M1 - M2): M1-like (&gt; 0.1), M2-like (&lt; -0.1), or Intermediate. A direct differential expression contrast was then executed between M1-like macrophages (ident.1) and M2-like macrophages (ident.2) using the volcano plot.</w:t>
+      </w:r>
+    </w:p>
+    <w:p>
+      <w:pPr>
+        <w:pStyle w:val="Heading3"/>
+        <w:rPr>
+          <w:lang w:val="en-US"/>
+        </w:rPr>
+      </w:pPr>
+      <w:r>
+        <w:rPr>
+          <w:lang w:val="en-US"/>
+        </w:rPr>
+        <w:t>Pathway Enrichment Analysis of Macrophage Polarization States</w:t>
+      </w:r>
+    </w:p>
+    <w:p>
+      <w:pPr>
+        <w:rPr>
+          <w:lang w:val="en-US"/>
+        </w:rPr>
+      </w:pPr>
+      <w:r>
+        <w:rPr>
+          <w:lang w:val="en-US"/>
+        </w:rPr>
+        <w:t xml:space="preserve">Genes differentially expressed between M1-like and M2-like macrophages (FDR &lt; 0.05, log_2FC &gt; 1) were subjected to ORA using </w:t>
+      </w:r>
+      <w:proofErr w:type="spellStart"/>
+      <w:r>
+        <w:rPr>
+          <w:lang w:val="en-US"/>
+        </w:rPr>
+        <w:t>clusterProfiler</w:t>
+      </w:r>
+      <w:proofErr w:type="spellEnd"/>
+      <w:r>
+        <w:rPr>
+          <w:lang w:val="en-US"/>
+        </w:rPr>
+        <w:t xml:space="preserve"> and </w:t>
+      </w:r>
+      <w:proofErr w:type="spellStart"/>
+      <w:r>
+        <w:rPr>
+          <w:lang w:val="en-US"/>
+        </w:rPr>
+        <w:t>ReactomePA</w:t>
+      </w:r>
+      <w:proofErr w:type="spellEnd"/>
+      <w:r>
+        <w:rPr>
+          <w:lang w:val="en-US"/>
+        </w:rPr>
+        <w:t>. Biological enrichment patterns were evaluated across REACTOME pathways, KEGG pathways, and GO sub-ontologies. Enriched processes specific to M1-like (positive scores) versus M2-like (negative scores) states were displayed as diverging bar plots.</w:t>
+      </w:r>
+    </w:p>
+    <w:p>
+      <w:pPr>
+        <w:rPr>
+          <w:lang w:val="en-US"/>
+        </w:rPr>
+      </w:pPr>
     </w:p>
     <w:p>
       <w:pPr>
@@ -1633,122 +2611,413 @@
           <w:lang w:val="en-US"/>
         </w:rPr>
       </w:pPr>
-      <w:r>
-        <w:rPr>
-          <w:lang w:val="en-US"/>
-        </w:rPr>
-        <w:t>Automated Annotation of the defined clusters</w:t>
-      </w:r>
-    </w:p>
-    <w:p>
-      <w:pPr>
-        <w:rPr>
-          <w:lang w:val="en-US"/>
-        </w:rPr>
-      </w:pPr>
-      <w:r>
-        <w:rPr>
-          <w:lang w:val="en-US"/>
-        </w:rPr>
-        <w:t xml:space="preserve">Automated cell-type annotation of the single-cell transcriptomic dataset was performed using the </w:t>
-      </w:r>
-      <w:proofErr w:type="spellStart"/>
-      <w:r>
-        <w:rPr>
-          <w:lang w:val="en-US"/>
-        </w:rPr>
-        <w:t>SingleR</w:t>
-      </w:r>
-      <w:proofErr w:type="spellEnd"/>
-      <w:r>
-        <w:rPr>
-          <w:lang w:val="en-US"/>
-        </w:rPr>
-        <w:t xml:space="preserve"> package. The Seurat object was converted into a </w:t>
-      </w:r>
-      <w:proofErr w:type="spellStart"/>
-      <w:r>
-        <w:rPr>
-          <w:lang w:val="en-US"/>
-        </w:rPr>
-        <w:t>SingleCellExperiment</w:t>
-      </w:r>
-      <w:proofErr w:type="spellEnd"/>
-      <w:r>
-        <w:rPr>
-          <w:lang w:val="en-US"/>
-        </w:rPr>
-        <w:t xml:space="preserve"> object and queried against two reference datasets from the </w:t>
-      </w:r>
-      <w:proofErr w:type="spellStart"/>
-      <w:r>
-        <w:rPr>
-          <w:lang w:val="en-US"/>
-        </w:rPr>
-        <w:t>celldex</w:t>
-      </w:r>
-      <w:proofErr w:type="spellEnd"/>
-      <w:r>
-        <w:rPr>
-          <w:lang w:val="en-US"/>
-        </w:rPr>
-        <w:t xml:space="preserve"> package: the Human Primary Cell Atlas Data (</w:t>
-      </w:r>
-      <w:proofErr w:type="spellStart"/>
-      <w:r>
-        <w:rPr>
-          <w:lang w:val="en-US"/>
-        </w:rPr>
-        <w:t>HumanPrimaryCellAtlasData</w:t>
-      </w:r>
-      <w:proofErr w:type="spellEnd"/>
-      <w:r>
-        <w:rPr>
-          <w:lang w:val="en-US"/>
-        </w:rPr>
-        <w:t>) and the Monaco Immune Data (</w:t>
-      </w:r>
-      <w:proofErr w:type="spellStart"/>
-      <w:r>
-        <w:rPr>
-          <w:lang w:val="en-US"/>
-        </w:rPr>
-        <w:t>MonacoImmuneData</w:t>
-      </w:r>
-      <w:proofErr w:type="spellEnd"/>
-      <w:r>
-        <w:rPr>
-          <w:lang w:val="en-US"/>
-        </w:rPr>
-        <w:t>). Main cell-type labels (</w:t>
-      </w:r>
-      <w:proofErr w:type="spellStart"/>
-      <w:r>
-        <w:rPr>
-          <w:lang w:val="en-US"/>
-        </w:rPr>
-        <w:t>label.main</w:t>
-      </w:r>
-      <w:proofErr w:type="spellEnd"/>
-      <w:r>
-        <w:rPr>
-          <w:lang w:val="en-US"/>
-        </w:rPr>
-        <w:t xml:space="preserve">) from both references were utilized simultaneously to assign predictions to individual cells. The resulting predicted labels were added back to the Seurat object metadata and visualized using Uniform Manifold Approximation and Projection (UMAP) dimensionality reduction plots generated via </w:t>
-      </w:r>
-      <w:proofErr w:type="spellStart"/>
-      <w:r>
-        <w:rPr>
-          <w:lang w:val="en-US"/>
-        </w:rPr>
-        <w:t>DimPlot</w:t>
-      </w:r>
-      <w:proofErr w:type="spellEnd"/>
-      <w:r>
-        <w:rPr>
-          <w:lang w:val="en-US"/>
-        </w:rPr>
-        <w:t>.</w:t>
+      <w:proofErr w:type="spellStart"/>
+      <w:r>
+        <w:rPr>
+          <w:lang w:val="en-US"/>
+        </w:rPr>
+        <w:t>CellChat</w:t>
+      </w:r>
+      <w:proofErr w:type="spellEnd"/>
+      <w:r>
+        <w:rPr>
+          <w:lang w:val="en-US"/>
+        </w:rPr>
+        <w:t xml:space="preserve"> Model Construction and Ligand-Receptor Database Mapping</w:t>
+      </w:r>
+    </w:p>
+    <w:p>
+      <w:pPr>
+        <w:rPr>
+          <w:lang w:val="en-US"/>
+        </w:rPr>
+      </w:pPr>
+      <w:r>
+        <w:rPr>
+          <w:lang w:val="en-US"/>
+        </w:rPr>
+        <w:t>Single-cell transcriptomic profiles were integrated across datasets to focus on microenvironmental interaction dynamics. Myeloid sub-clusters annotated by functional polarization state replaced the myeloid cluster, followed by assay layer integration (</w:t>
+      </w:r>
+      <w:proofErr w:type="spellStart"/>
+      <w:r>
+        <w:rPr>
+          <w:lang w:val="en-US"/>
+        </w:rPr>
+        <w:t>JoinLayers</w:t>
+      </w:r>
+      <w:proofErr w:type="spellEnd"/>
+      <w:r>
+        <w:rPr>
+          <w:lang w:val="en-US"/>
+        </w:rPr>
+        <w:t>) under the default RNA assay within Seurat. The dataset was subsequently filtered to isolate five key cell populations of interest: pericytes/fibroblasts (</w:t>
+      </w:r>
+      <w:proofErr w:type="spellStart"/>
+      <w:r>
+        <w:rPr>
+          <w:lang w:val="en-US"/>
+        </w:rPr>
+        <w:t>Pericyte_fibroblast</w:t>
+      </w:r>
+      <w:proofErr w:type="spellEnd"/>
+      <w:r>
+        <w:rPr>
+          <w:lang w:val="en-US"/>
+        </w:rPr>
+        <w:t>), M1-like macrophages (Macrophage_M1-like), M2-like macrophages (Macrophage_M2-like), M1-like microglia (Microglia_M1-like), and M2-like microglia (Microglia_M2-like).</w:t>
+      </w:r>
+    </w:p>
+    <w:p>
+      <w:pPr>
+        <w:rPr>
+          <w:lang w:val="en-US"/>
+        </w:rPr>
+      </w:pPr>
+      <w:r>
+        <w:rPr>
+          <w:lang w:val="en-US"/>
+        </w:rPr>
+        <w:t xml:space="preserve">Inferred cell-cell communication networks were reconstructed using the </w:t>
+      </w:r>
+      <w:proofErr w:type="spellStart"/>
+      <w:r>
+        <w:rPr>
+          <w:lang w:val="en-US"/>
+        </w:rPr>
+        <w:t>CellChat</w:t>
+      </w:r>
+      <w:proofErr w:type="spellEnd"/>
+      <w:r>
+        <w:rPr>
+          <w:lang w:val="en-US"/>
+        </w:rPr>
+        <w:t xml:space="preserve"> R package. Expression matrices and cell metadata annotations were extracted to initialize a </w:t>
+      </w:r>
+      <w:proofErr w:type="spellStart"/>
+      <w:r>
+        <w:rPr>
+          <w:lang w:val="en-US"/>
+        </w:rPr>
+        <w:t>CellChat</w:t>
+      </w:r>
+      <w:proofErr w:type="spellEnd"/>
+      <w:r>
+        <w:rPr>
+          <w:lang w:val="en-US"/>
+        </w:rPr>
+        <w:t xml:space="preserve"> object grouped by </w:t>
+      </w:r>
+      <w:proofErr w:type="spellStart"/>
+      <w:r>
+        <w:rPr>
+          <w:lang w:val="en-US"/>
+        </w:rPr>
+        <w:t>DEG_annotation</w:t>
+      </w:r>
+      <w:proofErr w:type="spellEnd"/>
+      <w:r>
+        <w:rPr>
+          <w:lang w:val="en-US"/>
+        </w:rPr>
+        <w:t xml:space="preserve">. Human ligand-receptor interactions were assigned from </w:t>
+      </w:r>
+      <w:proofErr w:type="spellStart"/>
+      <w:r>
+        <w:rPr>
+          <w:lang w:val="en-US"/>
+        </w:rPr>
+        <w:t>CellChatDB.human</w:t>
+      </w:r>
+      <w:proofErr w:type="spellEnd"/>
+      <w:r>
+        <w:rPr>
+          <w:lang w:val="en-US"/>
+        </w:rPr>
+        <w:t xml:space="preserve">. To optimize computational performance without altering signal detection, the expression matrix was </w:t>
+      </w:r>
+      <w:proofErr w:type="spellStart"/>
+      <w:r>
+        <w:rPr>
+          <w:lang w:val="en-US"/>
+        </w:rPr>
+        <w:t>subsetted</w:t>
+      </w:r>
+      <w:proofErr w:type="spellEnd"/>
+      <w:r>
+        <w:rPr>
+          <w:lang w:val="en-US"/>
+        </w:rPr>
+        <w:t xml:space="preserve"> (</w:t>
+      </w:r>
+      <w:proofErr w:type="spellStart"/>
+      <w:r>
+        <w:rPr>
+          <w:lang w:val="en-US"/>
+        </w:rPr>
+        <w:t>subsetData</w:t>
+      </w:r>
+      <w:proofErr w:type="spellEnd"/>
+      <w:r>
+        <w:rPr>
+          <w:lang w:val="en-US"/>
+        </w:rPr>
+        <w:t>) to retain only genes corresponding to established ligands and receptors present within the curated database.</w:t>
+      </w:r>
+    </w:p>
+    <w:p>
+      <w:pPr>
+        <w:pStyle w:val="Heading3"/>
+        <w:rPr>
+          <w:lang w:val="en-US"/>
+        </w:rPr>
+      </w:pPr>
+      <w:r>
+        <w:rPr>
+          <w:lang w:val="en-US"/>
+        </w:rPr>
+        <w:t>Identification of Overexpressed Signal Pairs and Network Inference</w:t>
+      </w:r>
+    </w:p>
+    <w:p>
+      <w:pPr>
+        <w:rPr>
+          <w:lang w:val="en-US"/>
+        </w:rPr>
+      </w:pPr>
+      <w:r>
+        <w:rPr>
+          <w:lang w:val="en-US"/>
+        </w:rPr>
+        <w:t xml:space="preserve">Overexpressed signaling genes across the defined cell clusters were identified using </w:t>
+      </w:r>
+      <w:proofErr w:type="spellStart"/>
+      <w:r>
+        <w:rPr>
+          <w:lang w:val="en-US"/>
+        </w:rPr>
+        <w:t>identifyOverExpressedGenes</w:t>
+      </w:r>
+      <w:proofErr w:type="spellEnd"/>
+      <w:r>
+        <w:rPr>
+          <w:lang w:val="en-US"/>
+        </w:rPr>
+        <w:t xml:space="preserve"> paired with presto-accelerated differential expression. Overexpressed ligand-receptor interactions were subsequently determined (</w:t>
+      </w:r>
+      <w:proofErr w:type="spellStart"/>
+      <w:r>
+        <w:rPr>
+          <w:lang w:val="en-US"/>
+        </w:rPr>
+        <w:t>identifyOverExpressedInteractions</w:t>
+      </w:r>
+      <w:proofErr w:type="spellEnd"/>
+      <w:r>
+        <w:rPr>
+          <w:lang w:val="en-US"/>
+        </w:rPr>
+        <w:t>) by filtering for pairs in which both signaling partners demonstrated significant group-wise overexpression. Communication probabilities between cell clusters were calculated (</w:t>
+      </w:r>
+      <w:proofErr w:type="spellStart"/>
+      <w:r>
+        <w:rPr>
+          <w:lang w:val="en-US"/>
+        </w:rPr>
+        <w:t>computeCommunProb</w:t>
+      </w:r>
+      <w:proofErr w:type="spellEnd"/>
+      <w:r>
+        <w:rPr>
+          <w:lang w:val="en-US"/>
+        </w:rPr>
+        <w:t xml:space="preserve">) using law of mass action modeling based on average ligand and receptor expression levels. Interactions originating from rare cell groups containing fewer than 10 cells were removed using </w:t>
+      </w:r>
+      <w:proofErr w:type="spellStart"/>
+      <w:r>
+        <w:rPr>
+          <w:lang w:val="en-US"/>
+        </w:rPr>
+        <w:t>filterCommunication</w:t>
+      </w:r>
+      <w:proofErr w:type="spellEnd"/>
+      <w:r>
+        <w:rPr>
+          <w:lang w:val="en-US"/>
+        </w:rPr>
+        <w:t xml:space="preserve"> to mitigate low-confidence observational noise.</w:t>
+      </w:r>
+    </w:p>
+    <w:p>
+      <w:pPr>
+        <w:pStyle w:val="Heading3"/>
+        <w:rPr>
+          <w:lang w:val="en-US"/>
+        </w:rPr>
+      </w:pPr>
+      <w:r>
+        <w:rPr>
+          <w:lang w:val="en-US"/>
+        </w:rPr>
+        <w:t>Pathway Communication Network Aggregation</w:t>
+      </w:r>
+    </w:p>
+    <w:p>
+      <w:pPr>
+        <w:rPr>
+          <w:lang w:val="en-US"/>
+        </w:rPr>
+      </w:pPr>
+      <w:r>
+        <w:rPr>
+          <w:lang w:val="en-US"/>
+        </w:rPr>
+        <w:t>Individual ligand-receptor communication probabilities were aggregated to evaluate signaling strengths at the pathway level (</w:t>
+      </w:r>
+      <w:proofErr w:type="spellStart"/>
+      <w:r>
+        <w:rPr>
+          <w:lang w:val="en-US"/>
+        </w:rPr>
+        <w:t>computeCommunProbPathway</w:t>
+      </w:r>
+      <w:proofErr w:type="spellEnd"/>
+      <w:r>
+        <w:rPr>
+          <w:lang w:val="en-US"/>
+        </w:rPr>
+        <w:t xml:space="preserve">). Total network interactions were synthesized using </w:t>
+      </w:r>
+      <w:proofErr w:type="spellStart"/>
+      <w:r>
+        <w:rPr>
+          <w:lang w:val="en-US"/>
+        </w:rPr>
+        <w:t>aggregateNet</w:t>
+      </w:r>
+      <w:proofErr w:type="spellEnd"/>
+      <w:r>
+        <w:rPr>
+          <w:lang w:val="en-US"/>
+        </w:rPr>
+        <w:t xml:space="preserve"> to generate cell-group interaction matrices corresponding to raw signaling counts and weighted communication probabilities (strength). In addition, cell-type-specific signaling subsets were generated by filtering communication outputs specifically for pericyte/fibroblast source populations (</w:t>
+      </w:r>
+      <w:proofErr w:type="spellStart"/>
+      <w:r>
+        <w:rPr>
+          <w:lang w:val="en-US"/>
+        </w:rPr>
+        <w:t>sources.use</w:t>
+      </w:r>
+      <w:proofErr w:type="spellEnd"/>
+      <w:r>
+        <w:rPr>
+          <w:lang w:val="en-US"/>
+        </w:rPr>
+        <w:t xml:space="preserve"> = "</w:t>
+      </w:r>
+      <w:proofErr w:type="spellStart"/>
+      <w:r>
+        <w:rPr>
+          <w:lang w:val="en-US"/>
+        </w:rPr>
+        <w:t>Pericyte_fibroblast</w:t>
+      </w:r>
+      <w:proofErr w:type="spellEnd"/>
+      <w:r>
+        <w:rPr>
+          <w:lang w:val="en-US"/>
+        </w:rPr>
+        <w:t>").</w:t>
+      </w:r>
+    </w:p>
+    <w:p>
+      <w:pPr>
+        <w:pStyle w:val="Heading3"/>
+        <w:rPr>
+          <w:lang w:val="en-US"/>
+        </w:rPr>
+      </w:pPr>
+      <w:r>
+        <w:rPr>
+          <w:lang w:val="en-US"/>
+        </w:rPr>
+        <w:t>Network Visualization and Ligand-Receptor Interactions</w:t>
+      </w:r>
+    </w:p>
+    <w:p>
+      <w:pPr>
+        <w:rPr>
+          <w:lang w:val="en-US"/>
+        </w:rPr>
+      </w:pPr>
+      <w:r>
+        <w:rPr>
+          <w:lang w:val="en-US"/>
+        </w:rPr>
+        <w:t>Macro-level communication structure was visualized using circular network plots (</w:t>
+      </w:r>
+      <w:proofErr w:type="spellStart"/>
+      <w:r>
+        <w:rPr>
+          <w:lang w:val="en-US"/>
+        </w:rPr>
+        <w:t>netVisual_circle</w:t>
+      </w:r>
+      <w:proofErr w:type="spellEnd"/>
+      <w:r>
+        <w:rPr>
+          <w:lang w:val="en-US"/>
+        </w:rPr>
+        <w:t>) displaying total interaction counts and weighted interaction strengths across all cell groups. Enriched signaling pathways were extracted, and individual pathway networks were rendered into high-resolution circular plots using automated layout functions (</w:t>
+      </w:r>
+      <w:proofErr w:type="spellStart"/>
+      <w:r>
+        <w:rPr>
+          <w:lang w:val="en-US"/>
+        </w:rPr>
+        <w:t>netVisual_aggregate</w:t>
+      </w:r>
+      <w:proofErr w:type="spellEnd"/>
+      <w:r>
+        <w:rPr>
+          <w:lang w:val="en-US"/>
+        </w:rPr>
+        <w:t xml:space="preserve">). Communication data frames containing inferred probabilities and significance metrics (p &lt; 0.01) were extracted via </w:t>
+      </w:r>
+      <w:proofErr w:type="spellStart"/>
+      <w:r>
+        <w:rPr>
+          <w:lang w:val="en-US"/>
+        </w:rPr>
+        <w:t>subsetCommunication</w:t>
+      </w:r>
+      <w:proofErr w:type="spellEnd"/>
+      <w:r>
+        <w:rPr>
+          <w:lang w:val="en-US"/>
+        </w:rPr>
+        <w:t xml:space="preserve">. Custom processing pipelines generated faceted dot plots visualizing communication probabilities across target cell pairs, evaluated both globally and </w:t>
+      </w:r>
+      <w:r>
+        <w:rPr>
+          <w:lang w:val="en-US"/>
+        </w:rPr>
+        <w:lastRenderedPageBreak/>
+        <w:t>specifically for fibroblast-directed interactions, while systematically comparing networks with and without self-communication.</w:t>
+      </w:r>
+    </w:p>
+    <w:p>
+      <w:pPr>
+        <w:pStyle w:val="Heading1"/>
+        <w:rPr>
+          <w:lang w:val="en-US"/>
+        </w:rPr>
+      </w:pPr>
+      <w:r>
+        <w:rPr>
+          <w:lang w:val="en-US"/>
+        </w:rPr>
+        <w:t>Results</w:t>
       </w:r>
     </w:p>
     <w:p>
@@ -1762,131 +3031,20 @@
         <w:rPr>
           <w:lang w:val="en-US"/>
         </w:rPr>
-        <w:t>Differential expression annotation of the defined clusters</w:t>
-      </w:r>
-    </w:p>
-    <w:p>
-      <w:pPr>
-        <w:rPr>
-          <w:lang w:val="en-US"/>
-        </w:rPr>
-      </w:pPr>
-      <w:r>
-        <w:rPr>
-          <w:lang w:val="en-US"/>
-        </w:rPr>
-        <w:t xml:space="preserve">To biologically annotate and refine the unsupervised clusters, marker genes for each cluster were identified using Seurat's </w:t>
-      </w:r>
-      <w:proofErr w:type="spellStart"/>
-      <w:r>
-        <w:rPr>
-          <w:lang w:val="en-US"/>
-        </w:rPr>
-        <w:t>FindAllMarkers</w:t>
-      </w:r>
-      <w:proofErr w:type="spellEnd"/>
-      <w:r>
-        <w:rPr>
-          <w:lang w:val="en-US"/>
-        </w:rPr>
-        <w:t xml:space="preserve"> function, restricting evaluation to upregulated genes (</w:t>
-      </w:r>
-      <w:proofErr w:type="spellStart"/>
-      <w:r>
-        <w:rPr>
-          <w:lang w:val="en-US"/>
-        </w:rPr>
-        <w:t>only.pos</w:t>
-      </w:r>
-      <w:proofErr w:type="spellEnd"/>
-      <w:r>
-        <w:rPr>
-          <w:lang w:val="en-US"/>
-        </w:rPr>
-        <w:t xml:space="preserve"> = TRUE) with a minimum expression fraction threshold (min.pct = 0.25) and a log2 fold-change threshold (</w:t>
-      </w:r>
-      <w:proofErr w:type="spellStart"/>
-      <w:r>
-        <w:rPr>
-          <w:lang w:val="en-US"/>
-        </w:rPr>
-        <w:t>logfc.threshold</w:t>
-      </w:r>
-      <w:proofErr w:type="spellEnd"/>
-      <w:r>
-        <w:rPr>
-          <w:lang w:val="en-US"/>
-        </w:rPr>
-        <w:t xml:space="preserve"> = 0.25). The top 25 marker genes per cluster based on average log2 fold-change (avg_log2FC) were extracted and saved. Clusters 0 through 14 were manually annotated into broad lineages and tumor states based on marker expression signatures.  Identified cell types were assigned to active cluster identities and visualized on UMAP plots.</w:t>
-      </w:r>
-    </w:p>
-    <w:p>
-      <w:pPr>
-        <w:pStyle w:val="Heading3"/>
-        <w:rPr>
-          <w:lang w:val="en-US"/>
-        </w:rPr>
-      </w:pPr>
-      <w:r>
-        <w:rPr>
-          <w:lang w:val="en-US"/>
-        </w:rPr>
-        <w:t>A heatmap as QC to Check for NAs</w:t>
-      </w:r>
-    </w:p>
-    <w:p>
-      <w:pPr>
-        <w:rPr>
-          <w:lang w:val="en-US"/>
-        </w:rPr>
-      </w:pPr>
-      <w:r>
-        <w:rPr>
-          <w:lang w:val="en-US"/>
-        </w:rPr>
-        <w:t>Prior to expression visualization, quality control checks were conducted on the cell type metadata (</w:t>
-      </w:r>
-      <w:proofErr w:type="spellStart"/>
-      <w:r>
-        <w:rPr>
-          <w:lang w:val="en-US"/>
-        </w:rPr>
-        <w:t>cell_type</w:t>
-      </w:r>
-      <w:proofErr w:type="spellEnd"/>
-      <w:r>
-        <w:rPr>
-          <w:lang w:val="en-US"/>
-        </w:rPr>
-        <w:t>) to verify data integrity and confirm the absence of missing values (NA). Cells with valid annotations were retained, and expression patterns of selected marker genes (</w:t>
-      </w:r>
-      <w:proofErr w:type="spellStart"/>
-      <w:r>
-        <w:rPr>
-          <w:lang w:val="en-US"/>
-        </w:rPr>
-        <w:t>genes_to_plot</w:t>
-      </w:r>
-      <w:proofErr w:type="spellEnd"/>
-      <w:r>
-        <w:rPr>
-          <w:lang w:val="en-US"/>
-        </w:rPr>
-        <w:t xml:space="preserve">) across cell-type identities were visualized using Seurat's </w:t>
-      </w:r>
-      <w:proofErr w:type="spellStart"/>
-      <w:r>
-        <w:rPr>
-          <w:lang w:val="en-US"/>
-        </w:rPr>
-        <w:t>DoHeatmap</w:t>
-      </w:r>
-      <w:proofErr w:type="spellEnd"/>
-      <w:r>
-        <w:rPr>
-          <w:lang w:val="en-US"/>
-        </w:rPr>
-        <w:t>. Gene expression values were scaled and displayed using a custom color gradient.</w:t>
+        <w:t>Data Loading</w:t>
+      </w:r>
+    </w:p>
+    <w:p>
+      <w:pPr>
+        <w:rPr>
+          <w:lang w:val="en-US"/>
+        </w:rPr>
+      </w:pPr>
+      <w:r>
+        <w:rPr>
+          <w:lang w:val="en-US"/>
+        </w:rPr>
+        <w:t>Single-cell transcriptomic profiles were successfully loaded across all five brain metastasis specimens (BRBMET2, BRBMET3, BRBMET87, LUBMET7, and LUBMET1), generating independent initial Seurat objects for each dataset.</w:t>
       </w:r>
     </w:p>
     <w:p>
@@ -1900,1029 +3058,6 @@
         <w:rPr>
           <w:lang w:val="en-US"/>
         </w:rPr>
-        <w:t>Differential expression annotation of the Myeloid sub-clusters</w:t>
-      </w:r>
-    </w:p>
-    <w:p>
-      <w:pPr>
-        <w:rPr>
-          <w:lang w:val="en-US"/>
-        </w:rPr>
-      </w:pPr>
-      <w:r>
-        <w:rPr>
-          <w:lang w:val="en-US"/>
-        </w:rPr>
-        <w:t>Sub-clustering analysis was focused on the myeloid lineage. Differential expression analysis was performed on the myeloid sub-clusters, and significant markers (</w:t>
-      </w:r>
-      <w:proofErr w:type="spellStart"/>
-      <w:r>
-        <w:rPr>
-          <w:lang w:val="en-US"/>
-        </w:rPr>
-        <w:t>padj</w:t>
-      </w:r>
-      <w:proofErr w:type="spellEnd"/>
-      <w:r>
-        <w:rPr>
-          <w:lang w:val="en-US"/>
-        </w:rPr>
-        <w:t xml:space="preserve"> &lt; 0.05) were filtered. The top 25 markers per sub-cluster ranked by avg_log2FC were exported (top25_myeloid_markers.csv), followed by UMAP visualization.</w:t>
-      </w:r>
-    </w:p>
-    <w:p>
-      <w:pPr>
-        <w:pStyle w:val="Heading2"/>
-        <w:rPr>
-          <w:lang w:val="en-US"/>
-        </w:rPr>
-      </w:pPr>
-      <w:r>
-        <w:rPr>
-          <w:lang w:val="en-US"/>
-        </w:rPr>
-        <w:t>Determining of M1 and M2 states</w:t>
-      </w:r>
-    </w:p>
-    <w:p>
-      <w:pPr>
-        <w:rPr>
-          <w:lang w:val="en-US"/>
-        </w:rPr>
-      </w:pPr>
-      <w:r>
-        <w:rPr>
-          <w:lang w:val="en-US"/>
-        </w:rPr>
-        <w:t xml:space="preserve">To characterize functional polarization states within the myeloid population, module scores for canonical M1 (pro-inflammatory) and M2 (anti-inflammatory/immunosuppressive) gene sets were calculated using Seurat's </w:t>
-      </w:r>
-      <w:proofErr w:type="spellStart"/>
-      <w:r>
-        <w:rPr>
-          <w:lang w:val="en-US"/>
-        </w:rPr>
-        <w:t>AddModuleScore</w:t>
-      </w:r>
-      <w:proofErr w:type="spellEnd"/>
-      <w:r>
-        <w:rPr>
-          <w:lang w:val="en-US"/>
-        </w:rPr>
-        <w:t xml:space="preserve"> function. Module scores were evaluated across myeloid sub-clusters via violin plots (</w:t>
-      </w:r>
-      <w:proofErr w:type="spellStart"/>
-      <w:r>
-        <w:rPr>
-          <w:lang w:val="en-US"/>
-        </w:rPr>
-        <w:t>VlnPlot</w:t>
-      </w:r>
-      <w:proofErr w:type="spellEnd"/>
-      <w:r>
-        <w:rPr>
-          <w:lang w:val="en-US"/>
-        </w:rPr>
-        <w:t>), and mean scores as well as score differentials (M1 - M2) were calculated for each sub-cluster.</w:t>
-      </w:r>
-    </w:p>
-    <w:p>
-      <w:pPr>
-        <w:pStyle w:val="Heading3"/>
-        <w:rPr>
-          <w:lang w:val="en-US"/>
-        </w:rPr>
-      </w:pPr>
-      <w:r>
-        <w:rPr>
-          <w:lang w:val="en-US"/>
-        </w:rPr>
-        <w:lastRenderedPageBreak/>
-        <w:t>Annotation of M1 and M2 states</w:t>
-      </w:r>
-    </w:p>
-    <w:p>
-      <w:pPr>
-        <w:rPr>
-          <w:lang w:val="en-US"/>
-        </w:rPr>
-      </w:pPr>
-      <w:r>
-        <w:rPr>
-          <w:lang w:val="en-US"/>
-        </w:rPr>
-        <w:t xml:space="preserve">Myeloid sub-clusters were consolidated into broader lineages, merging cluster 0 and 1 into "Macrophage" while maintaining "Microglia" and other non-macrophage/microglia populations. A net polarization score was calculated for each cell as Delta S = {M1_score1} - {M2_score1}. </w:t>
-      </w:r>
-    </w:p>
-    <w:p>
-      <w:pPr>
-        <w:rPr>
-          <w:lang w:val="en-US"/>
-        </w:rPr>
-      </w:pPr>
-      <w:r>
-        <w:rPr>
-          <w:lang w:val="en-US"/>
-        </w:rPr>
-        <w:t>Polarization states were categorized based on a threshold (= 0.1): cells with Delta S &gt; 0.1 were assigned as "M1-like", cells with Delta S &lt; -0.1 as "M2-like", and cells falling between (-0.1 and 0.1) as "Intermediate". For Macrophage and Microglia lineages, composite annotations combining cell identity and polarization state (e.g., "Macrophage_M1-like") were assigned and visualized using UMAP projections.</w:t>
-      </w:r>
-    </w:p>
-    <w:p>
-      <w:pPr>
-        <w:pStyle w:val="Heading3"/>
-        <w:rPr>
-          <w:lang w:val="en-US"/>
-        </w:rPr>
-      </w:pPr>
-      <w:r>
-        <w:rPr>
-          <w:lang w:val="en-US"/>
-        </w:rPr>
-        <w:t>Visualizations of M1 and M2 states</w:t>
-      </w:r>
-    </w:p>
-    <w:p>
-      <w:pPr>
-        <w:rPr>
-          <w:lang w:val="en-US"/>
-        </w:rPr>
-      </w:pPr>
-      <w:r>
-        <w:rPr>
-          <w:lang w:val="en-US"/>
-        </w:rPr>
-        <w:t xml:space="preserve">Polarization dynamics and cell-state distributions were visualized through multiple complementary approaches: (1) UMAP projections of cell types split by polarization state (M1-like, M2-like, Intermediate); (2) UMAP feature plots displaying continuous Delta S values using a divergent color gradient (blue for M1-leaning, red for M2-leaning); (3) stacked bar charts (ggplot2) displaying the relative percentage distribution of M1-like, M2-like, and Intermediate states strictly within Macrophage and Microglia populations; and (4) sub-cluster UMAP feature maps paired with top marker heatmaps (top 5 markers per cluster, </w:t>
-      </w:r>
-      <w:proofErr w:type="spellStart"/>
-      <w:r>
-        <w:rPr>
-          <w:lang w:val="en-US"/>
-        </w:rPr>
-        <w:t>padj</w:t>
-      </w:r>
-      <w:proofErr w:type="spellEnd"/>
-      <w:r>
-        <w:rPr>
-          <w:lang w:val="en-US"/>
-        </w:rPr>
-        <w:t xml:space="preserve"> &lt; 0.05).</w:t>
-      </w:r>
-    </w:p>
-    <w:p>
-      <w:pPr>
-        <w:pStyle w:val="Heading2"/>
-        <w:rPr>
-          <w:lang w:val="en-US"/>
-        </w:rPr>
-      </w:pPr>
-      <w:r>
-        <w:rPr>
-          <w:lang w:val="en-US"/>
-        </w:rPr>
-        <w:t>Differential Expression Analysis and Volcano Plot Visualization</w:t>
-      </w:r>
-    </w:p>
-    <w:p>
-      <w:pPr>
-        <w:rPr>
-          <w:lang w:val="en-US"/>
-        </w:rPr>
-      </w:pPr>
-      <w:r>
-        <w:rPr>
-          <w:lang w:val="en-US"/>
-        </w:rPr>
-        <w:t xml:space="preserve">Differential expression analysis was performed using a two-sided Wilcoxon rank-sum test via the </w:t>
-      </w:r>
-      <w:proofErr w:type="spellStart"/>
-      <w:r>
-        <w:rPr>
-          <w:lang w:val="en-US"/>
-        </w:rPr>
-        <w:t>FindMarkers</w:t>
-      </w:r>
-      <w:proofErr w:type="spellEnd"/>
-      <w:r>
-        <w:rPr>
-          <w:lang w:val="en-US"/>
-        </w:rPr>
-        <w:t xml:space="preserve"> function in Seurat with a minimum cell fraction detection threshold (min.pct) of 0.1 and an absolute log2 fold-change threshold of 0. Differential expression results were categorized into significance tiers based on adjusted p-values calculated using the Benjamini-Hochberg false discovery rate (FDR) correction: highly significant (FDR &lt; 0.01 and log_2FC &gt; 1), significant (FDR &lt; 0.05), or non-significant. Volcano plots were constructed using ggplot2 and </w:t>
-      </w:r>
-      <w:proofErr w:type="spellStart"/>
-      <w:r>
-        <w:rPr>
-          <w:lang w:val="en-US"/>
-        </w:rPr>
-        <w:t>ggrepel</w:t>
-      </w:r>
-      <w:proofErr w:type="spellEnd"/>
-      <w:r>
-        <w:rPr>
-          <w:lang w:val="en-US"/>
-        </w:rPr>
-        <w:t xml:space="preserve">. To prevent visual distortion from extreme </w:t>
-      </w:r>
-      <w:proofErr w:type="spellStart"/>
-      <w:r>
-        <w:rPr>
-          <w:lang w:val="en-US"/>
-        </w:rPr>
-        <w:t>pvalues</w:t>
-      </w:r>
-      <w:proofErr w:type="spellEnd"/>
-      <w:r>
-        <w:rPr>
-          <w:lang w:val="en-US"/>
-        </w:rPr>
-        <w:t xml:space="preserve">, -log10pvalues were capped at 300. For representative gene annotation, the top 12 upregulated and downregulated genes per contrast were selected based on adjusted </w:t>
-      </w:r>
-      <w:proofErr w:type="spellStart"/>
-      <w:r>
-        <w:rPr>
-          <w:lang w:val="en-US"/>
-        </w:rPr>
-        <w:t>pvalue</w:t>
-      </w:r>
-      <w:proofErr w:type="spellEnd"/>
-      <w:r>
-        <w:rPr>
-          <w:lang w:val="en-US"/>
-        </w:rPr>
-        <w:t xml:space="preserve"> and log2 fold-change filtering, excluding lowly expressed outliers (cell fraction &lt; 0.1) and extreme fold-change fluctuations (log_2FC &gt; 6).</w:t>
-      </w:r>
-    </w:p>
-    <w:p>
-      <w:pPr>
-        <w:pStyle w:val="Heading2"/>
-        <w:rPr>
-          <w:lang w:val="en-US"/>
-        </w:rPr>
-      </w:pPr>
-      <w:r>
-        <w:rPr>
-          <w:lang w:val="en-US"/>
-        </w:rPr>
-        <w:t xml:space="preserve">Functional Enrichment Analysis (GO, KEGG, </w:t>
-      </w:r>
-      <w:proofErr w:type="spellStart"/>
-      <w:r>
-        <w:rPr>
-          <w:lang w:val="en-US"/>
-        </w:rPr>
-        <w:t>Reactome</w:t>
-      </w:r>
-      <w:proofErr w:type="spellEnd"/>
-      <w:r>
-        <w:rPr>
-          <w:lang w:val="en-US"/>
-        </w:rPr>
-        <w:t>)</w:t>
-      </w:r>
-    </w:p>
-    <w:p>
-      <w:pPr>
-        <w:rPr>
-          <w:lang w:val="en-US"/>
-        </w:rPr>
-      </w:pPr>
-      <w:r>
-        <w:rPr>
-          <w:lang w:val="en-US"/>
-        </w:rPr>
-        <w:t xml:space="preserve">Directional functional enrichment analysis was conducted separately for significantly upregulated (log_2FC &gt; 1, FDR &lt; 0.05) and downregulated (log_2FC &lt; -1, FDR &lt; 0.05) genes. Gene symbols were mapped to Entrez Gene IDs using the </w:t>
-      </w:r>
-      <w:proofErr w:type="spellStart"/>
-      <w:r>
-        <w:rPr>
-          <w:lang w:val="en-US"/>
-        </w:rPr>
-        <w:t>org.Hs.eg.db</w:t>
-      </w:r>
-      <w:proofErr w:type="spellEnd"/>
-      <w:r>
-        <w:rPr>
-          <w:lang w:val="en-US"/>
-        </w:rPr>
-        <w:t xml:space="preserve"> R package via </w:t>
-      </w:r>
-      <w:proofErr w:type="spellStart"/>
-      <w:r>
-        <w:rPr>
-          <w:lang w:val="en-US"/>
-        </w:rPr>
-        <w:t>clusterProfiler</w:t>
-      </w:r>
-      <w:proofErr w:type="spellEnd"/>
-      <w:r>
-        <w:rPr>
-          <w:lang w:val="en-US"/>
-        </w:rPr>
-        <w:t>::</w:t>
-      </w:r>
-      <w:proofErr w:type="spellStart"/>
-      <w:r>
-        <w:rPr>
-          <w:lang w:val="en-US"/>
-        </w:rPr>
-        <w:t>bitr</w:t>
-      </w:r>
-      <w:proofErr w:type="spellEnd"/>
-      <w:r>
-        <w:rPr>
-          <w:lang w:val="en-US"/>
-        </w:rPr>
-        <w:t xml:space="preserve">. </w:t>
-      </w:r>
-    </w:p>
-    <w:p>
-      <w:pPr>
-        <w:rPr>
-          <w:lang w:val="en-US"/>
-        </w:rPr>
-      </w:pPr>
-      <w:r>
-        <w:rPr>
-          <w:lang w:val="en-US"/>
-        </w:rPr>
-        <w:t xml:space="preserve">Over-representation analysis (ORA) was executed across Gene Ontology (GO) categories—Biological Process (BP), Molecular Function (MF), and Cellular Component (CC), as well as Kyoto Encyclopedia of Genes and Genomes (KEGG) pathways using </w:t>
-      </w:r>
-      <w:proofErr w:type="spellStart"/>
-      <w:r>
-        <w:rPr>
-          <w:lang w:val="en-US"/>
-        </w:rPr>
-        <w:t>clusterProfiler</w:t>
-      </w:r>
-      <w:proofErr w:type="spellEnd"/>
-      <w:r>
-        <w:rPr>
-          <w:lang w:val="en-US"/>
-        </w:rPr>
-        <w:t xml:space="preserve">, and </w:t>
-      </w:r>
-      <w:proofErr w:type="spellStart"/>
-      <w:r>
-        <w:rPr>
-          <w:lang w:val="en-US"/>
-        </w:rPr>
-        <w:t>Reactome</w:t>
-      </w:r>
-      <w:proofErr w:type="spellEnd"/>
-      <w:r>
-        <w:rPr>
-          <w:lang w:val="en-US"/>
-        </w:rPr>
-        <w:t xml:space="preserve"> pathways using </w:t>
-      </w:r>
-      <w:proofErr w:type="spellStart"/>
-      <w:r>
-        <w:rPr>
-          <w:lang w:val="en-US"/>
-        </w:rPr>
-        <w:t>ReactomePA</w:t>
-      </w:r>
-      <w:proofErr w:type="spellEnd"/>
-      <w:r>
-        <w:rPr>
-          <w:lang w:val="en-US"/>
-        </w:rPr>
-        <w:t xml:space="preserve">. Multiple-testing adjustments were performed using the Benjamini-Hochberg method, with terms exhibiting an adjusted </w:t>
-      </w:r>
-      <w:proofErr w:type="spellStart"/>
-      <w:r>
-        <w:rPr>
-          <w:lang w:val="en-US"/>
-        </w:rPr>
-        <w:t>pvalue</w:t>
-      </w:r>
-      <w:proofErr w:type="spellEnd"/>
-      <w:r>
-        <w:rPr>
-          <w:lang w:val="en-US"/>
-        </w:rPr>
-        <w:t xml:space="preserve"> &lt; 0.05 considered statistically enriched.</w:t>
-      </w:r>
-    </w:p>
-    <w:p>
-      <w:pPr>
-        <w:pStyle w:val="Heading3"/>
-        <w:rPr>
-          <w:lang w:val="en-US"/>
-        </w:rPr>
-      </w:pPr>
-      <w:r>
-        <w:rPr>
-          <w:lang w:val="en-US"/>
-        </w:rPr>
-        <w:lastRenderedPageBreak/>
-        <w:t>Pathway Enrichment Visualization</w:t>
-      </w:r>
-    </w:p>
-    <w:p>
-      <w:pPr>
-        <w:rPr>
-          <w:lang w:val="en-US"/>
-        </w:rPr>
-      </w:pPr>
-      <w:r>
-        <w:rPr>
-          <w:lang w:val="en-US"/>
-        </w:rPr>
-        <w:t>To facilitate intuitive comparison of biological themes across expression states, enriched functional terms were visualized using bidirectional diverging bar charts in ggplot2. The top 10 most significantly enriched terms (FDR &lt; 0.05) for upregulated and downregulated gene sets were plotted along a continuous normalized axis. Enriched pathways associated with upregulated genes were represented along positive values, whereas downregulated pathways extended along negative values. To handle potential duplicate descriptions across categories, uniquely formatted labels were mapped back to their original term names while preserving factor ordering.</w:t>
-      </w:r>
-    </w:p>
-    <w:p>
-      <w:pPr>
-        <w:pStyle w:val="Heading3"/>
-        <w:rPr>
-          <w:lang w:val="en-US"/>
-        </w:rPr>
-      </w:pPr>
-      <w:r>
-        <w:rPr>
-          <w:lang w:val="en-US"/>
-        </w:rPr>
-        <w:t>Differential Expression and Pathway Enrichment of Fibroblasts</w:t>
-      </w:r>
-    </w:p>
-    <w:p>
-      <w:pPr>
-        <w:rPr>
-          <w:lang w:val="en-US"/>
-        </w:rPr>
-      </w:pPr>
-      <w:r>
-        <w:rPr>
-          <w:lang w:val="en-US"/>
-        </w:rPr>
-        <w:t>Fibroblasts (pericyte/fibroblast cluster 11) were evaluated for differential gene expression against all remaining cell populations in the single-cell dataset using the Wilcoxon rank-sum test. Identified marker genes (FDR &lt; 0.01, log_2FC &gt; 1) were saved, and directional enrichment analysis was performed across REACTOME, KEGG, and GO ontologies (BP, MF, CC). Separate diverging bar plots were generated to visualize enriched biological functions characteristic of the fibroblast population.</w:t>
-      </w:r>
-    </w:p>
-    <w:p>
-      <w:pPr>
-        <w:pStyle w:val="Heading3"/>
-        <w:rPr>
-          <w:lang w:val="en-US"/>
-        </w:rPr>
-      </w:pPr>
-      <w:r>
-        <w:rPr>
-          <w:lang w:val="en-US"/>
-        </w:rPr>
-        <w:t>Differential Expression of M1-like vs. M2-like Macrophages</w:t>
-      </w:r>
-    </w:p>
-    <w:p>
-      <w:pPr>
-        <w:rPr>
-          <w:lang w:val="en-US"/>
-        </w:rPr>
-      </w:pPr>
-      <w:r>
-        <w:rPr>
-          <w:lang w:val="en-US"/>
-        </w:rPr>
-        <w:t xml:space="preserve">Myeloid single-cell clusters were annotated and </w:t>
-      </w:r>
-      <w:proofErr w:type="spellStart"/>
-      <w:r>
-        <w:rPr>
-          <w:lang w:val="en-US"/>
-        </w:rPr>
-        <w:t>subsetted</w:t>
-      </w:r>
-      <w:proofErr w:type="spellEnd"/>
-      <w:r>
-        <w:rPr>
-          <w:lang w:val="en-US"/>
-        </w:rPr>
-        <w:t xml:space="preserve"> to isolate macrophages and microglia. Polarization module scores for M1-like and M2-like transcriptional signatures were computed per cell using </w:t>
-      </w:r>
-      <w:proofErr w:type="spellStart"/>
-      <w:r>
-        <w:rPr>
-          <w:lang w:val="en-US"/>
-        </w:rPr>
-        <w:t>AddModuleScore</w:t>
-      </w:r>
-      <w:proofErr w:type="spellEnd"/>
-      <w:r>
-        <w:rPr>
-          <w:lang w:val="en-US"/>
-        </w:rPr>
-        <w:t>. Individual cells were categorized into polarization states based on the score differential (M1 - M2): M1-like (&gt; 0.1), M2-like (&lt; -0.1), or Intermediate. A direct differential expression contrast was then executed between M1-like macrophages (ident.1) and M2-like macrophages (ident.2) using the volcano plot.</w:t>
-      </w:r>
-    </w:p>
-    <w:p>
-      <w:pPr>
-        <w:pStyle w:val="Heading3"/>
-        <w:rPr>
-          <w:lang w:val="en-US"/>
-        </w:rPr>
-      </w:pPr>
-      <w:r>
-        <w:rPr>
-          <w:lang w:val="en-US"/>
-        </w:rPr>
-        <w:t>Pathway Enrichment Analysis of Macrophage Polarization States</w:t>
-      </w:r>
-    </w:p>
-    <w:p>
-      <w:pPr>
-        <w:rPr>
-          <w:lang w:val="en-US"/>
-        </w:rPr>
-      </w:pPr>
-      <w:r>
-        <w:rPr>
-          <w:lang w:val="en-US"/>
-        </w:rPr>
-        <w:t xml:space="preserve">Genes differentially expressed between M1-like and M2-like macrophages (FDR &lt; 0.05, log_2FC &gt; 1) were subjected to ORA using </w:t>
-      </w:r>
-      <w:proofErr w:type="spellStart"/>
-      <w:r>
-        <w:rPr>
-          <w:lang w:val="en-US"/>
-        </w:rPr>
-        <w:t>clusterProfiler</w:t>
-      </w:r>
-      <w:proofErr w:type="spellEnd"/>
-      <w:r>
-        <w:rPr>
-          <w:lang w:val="en-US"/>
-        </w:rPr>
-        <w:t xml:space="preserve"> and </w:t>
-      </w:r>
-      <w:proofErr w:type="spellStart"/>
-      <w:r>
-        <w:rPr>
-          <w:lang w:val="en-US"/>
-        </w:rPr>
-        <w:t>ReactomePA</w:t>
-      </w:r>
-      <w:proofErr w:type="spellEnd"/>
-      <w:r>
-        <w:rPr>
-          <w:lang w:val="en-US"/>
-        </w:rPr>
-        <w:t>. Biological enrichment patterns were evaluated across REACTOME pathways, KEGG pathways, and GO sub-ontologies. Enriched processes specific to M1-like (positive scores) versus M2-like (negative scores) states were displayed as diverging bar plots.</w:t>
-      </w:r>
-    </w:p>
-    <w:p>
-      <w:pPr>
-        <w:rPr>
-          <w:lang w:val="en-US"/>
-        </w:rPr>
-      </w:pPr>
-    </w:p>
-    <w:p>
-      <w:pPr>
-        <w:pStyle w:val="Heading2"/>
-        <w:rPr>
-          <w:lang w:val="en-US"/>
-        </w:rPr>
-      </w:pPr>
-      <w:proofErr w:type="spellStart"/>
-      <w:r>
-        <w:rPr>
-          <w:lang w:val="en-US"/>
-        </w:rPr>
-        <w:t>CellChat</w:t>
-      </w:r>
-      <w:proofErr w:type="spellEnd"/>
-      <w:r>
-        <w:rPr>
-          <w:lang w:val="en-US"/>
-        </w:rPr>
-        <w:t xml:space="preserve"> Model Construction and Ligand-Receptor Database Mapping</w:t>
-      </w:r>
-    </w:p>
-    <w:p>
-      <w:pPr>
-        <w:rPr>
-          <w:lang w:val="en-US"/>
-        </w:rPr>
-      </w:pPr>
-      <w:r>
-        <w:rPr>
-          <w:lang w:val="en-US"/>
-        </w:rPr>
-        <w:t>Single-cell transcriptomic profiles were integrated across datasets to focus on microenvironmental interaction dynamics. Myeloid sub-clusters annotated by functional polarization state replaced the myeloid cluster, followed by assay layer integration (</w:t>
-      </w:r>
-      <w:proofErr w:type="spellStart"/>
-      <w:r>
-        <w:rPr>
-          <w:lang w:val="en-US"/>
-        </w:rPr>
-        <w:t>JoinLayers</w:t>
-      </w:r>
-      <w:proofErr w:type="spellEnd"/>
-      <w:r>
-        <w:rPr>
-          <w:lang w:val="en-US"/>
-        </w:rPr>
-        <w:t>) under the default RNA assay within Seurat. The dataset was subsequently filtered to isolate five key cell populations of interest: pericytes/fibroblasts (</w:t>
-      </w:r>
-      <w:proofErr w:type="spellStart"/>
-      <w:r>
-        <w:rPr>
-          <w:lang w:val="en-US"/>
-        </w:rPr>
-        <w:t>Pericyte_fibroblast</w:t>
-      </w:r>
-      <w:proofErr w:type="spellEnd"/>
-      <w:r>
-        <w:rPr>
-          <w:lang w:val="en-US"/>
-        </w:rPr>
-        <w:t>), M1-like macrophages (Macrophage_M1-like), M2-like macrophages (Macrophage_M2-like), M1-like microglia (Microglia_M1-like), and M2-like microglia (Microglia_M2-like).</w:t>
-      </w:r>
-    </w:p>
-    <w:p>
-      <w:pPr>
-        <w:rPr>
-          <w:lang w:val="en-US"/>
-        </w:rPr>
-      </w:pPr>
-      <w:r>
-        <w:rPr>
-          <w:lang w:val="en-US"/>
-        </w:rPr>
-        <w:lastRenderedPageBreak/>
-        <w:t xml:space="preserve">Inferred cell-cell communication networks were reconstructed using the </w:t>
-      </w:r>
-      <w:proofErr w:type="spellStart"/>
-      <w:r>
-        <w:rPr>
-          <w:lang w:val="en-US"/>
-        </w:rPr>
-        <w:t>CellChat</w:t>
-      </w:r>
-      <w:proofErr w:type="spellEnd"/>
-      <w:r>
-        <w:rPr>
-          <w:lang w:val="en-US"/>
-        </w:rPr>
-        <w:t xml:space="preserve"> R package. Expression matrices and cell metadata annotations were extracted to initialize a </w:t>
-      </w:r>
-      <w:proofErr w:type="spellStart"/>
-      <w:r>
-        <w:rPr>
-          <w:lang w:val="en-US"/>
-        </w:rPr>
-        <w:t>CellChat</w:t>
-      </w:r>
-      <w:proofErr w:type="spellEnd"/>
-      <w:r>
-        <w:rPr>
-          <w:lang w:val="en-US"/>
-        </w:rPr>
-        <w:t xml:space="preserve"> object grouped by </w:t>
-      </w:r>
-      <w:proofErr w:type="spellStart"/>
-      <w:r>
-        <w:rPr>
-          <w:lang w:val="en-US"/>
-        </w:rPr>
-        <w:t>DEG_annotation</w:t>
-      </w:r>
-      <w:proofErr w:type="spellEnd"/>
-      <w:r>
-        <w:rPr>
-          <w:lang w:val="en-US"/>
-        </w:rPr>
-        <w:t xml:space="preserve">. Human ligand-receptor interactions were assigned from </w:t>
-      </w:r>
-      <w:proofErr w:type="spellStart"/>
-      <w:r>
-        <w:rPr>
-          <w:lang w:val="en-US"/>
-        </w:rPr>
-        <w:t>CellChatDB.human</w:t>
-      </w:r>
-      <w:proofErr w:type="spellEnd"/>
-      <w:r>
-        <w:rPr>
-          <w:lang w:val="en-US"/>
-        </w:rPr>
-        <w:t xml:space="preserve">. To optimize computational performance without altering signal detection, the expression matrix was </w:t>
-      </w:r>
-      <w:proofErr w:type="spellStart"/>
-      <w:r>
-        <w:rPr>
-          <w:lang w:val="en-US"/>
-        </w:rPr>
-        <w:t>subsetted</w:t>
-      </w:r>
-      <w:proofErr w:type="spellEnd"/>
-      <w:r>
-        <w:rPr>
-          <w:lang w:val="en-US"/>
-        </w:rPr>
-        <w:t xml:space="preserve"> (</w:t>
-      </w:r>
-      <w:proofErr w:type="spellStart"/>
-      <w:r>
-        <w:rPr>
-          <w:lang w:val="en-US"/>
-        </w:rPr>
-        <w:t>subsetData</w:t>
-      </w:r>
-      <w:proofErr w:type="spellEnd"/>
-      <w:r>
-        <w:rPr>
-          <w:lang w:val="en-US"/>
-        </w:rPr>
-        <w:t>) to retain only genes corresponding to established ligands and receptors present within the curated database.</w:t>
-      </w:r>
-    </w:p>
-    <w:p>
-      <w:pPr>
-        <w:pStyle w:val="Heading3"/>
-        <w:rPr>
-          <w:lang w:val="en-US"/>
-        </w:rPr>
-      </w:pPr>
-      <w:r>
-        <w:rPr>
-          <w:lang w:val="en-US"/>
-        </w:rPr>
-        <w:t>Identification of Overexpressed Signal Pairs and Network Inference</w:t>
-      </w:r>
-    </w:p>
-    <w:p>
-      <w:pPr>
-        <w:rPr>
-          <w:lang w:val="en-US"/>
-        </w:rPr>
-      </w:pPr>
-      <w:r>
-        <w:rPr>
-          <w:lang w:val="en-US"/>
-        </w:rPr>
-        <w:t xml:space="preserve">Overexpressed signaling genes across the defined cell clusters were identified using </w:t>
-      </w:r>
-      <w:proofErr w:type="spellStart"/>
-      <w:r>
-        <w:rPr>
-          <w:lang w:val="en-US"/>
-        </w:rPr>
-        <w:t>identifyOverExpressedGenes</w:t>
-      </w:r>
-      <w:proofErr w:type="spellEnd"/>
-      <w:r>
-        <w:rPr>
-          <w:lang w:val="en-US"/>
-        </w:rPr>
-        <w:t xml:space="preserve"> paired with presto-accelerated differential expression. Overexpressed ligand-receptor interactions were subsequently determined (</w:t>
-      </w:r>
-      <w:proofErr w:type="spellStart"/>
-      <w:r>
-        <w:rPr>
-          <w:lang w:val="en-US"/>
-        </w:rPr>
-        <w:t>identifyOverExpressedInteractions</w:t>
-      </w:r>
-      <w:proofErr w:type="spellEnd"/>
-      <w:r>
-        <w:rPr>
-          <w:lang w:val="en-US"/>
-        </w:rPr>
-        <w:t>) by filtering for pairs in which both signaling partners demonstrated significant group-wise overexpression. Communication probabilities between cell clusters were calculated (</w:t>
-      </w:r>
-      <w:proofErr w:type="spellStart"/>
-      <w:r>
-        <w:rPr>
-          <w:lang w:val="en-US"/>
-        </w:rPr>
-        <w:t>computeCommunProb</w:t>
-      </w:r>
-      <w:proofErr w:type="spellEnd"/>
-      <w:r>
-        <w:rPr>
-          <w:lang w:val="en-US"/>
-        </w:rPr>
-        <w:t xml:space="preserve">) using law of mass action modeling based on average ligand and receptor expression levels. Interactions originating from rare cell groups containing fewer than 10 cells were removed using </w:t>
-      </w:r>
-      <w:proofErr w:type="spellStart"/>
-      <w:r>
-        <w:rPr>
-          <w:lang w:val="en-US"/>
-        </w:rPr>
-        <w:t>filterCommunication</w:t>
-      </w:r>
-      <w:proofErr w:type="spellEnd"/>
-      <w:r>
-        <w:rPr>
-          <w:lang w:val="en-US"/>
-        </w:rPr>
-        <w:t xml:space="preserve"> to mitigate low-confidence observational noise.</w:t>
-      </w:r>
-    </w:p>
-    <w:p>
-      <w:pPr>
-        <w:pStyle w:val="Heading3"/>
-        <w:rPr>
-          <w:lang w:val="en-US"/>
-        </w:rPr>
-      </w:pPr>
-      <w:r>
-        <w:rPr>
-          <w:lang w:val="en-US"/>
-        </w:rPr>
-        <w:t>Pathway Communication Network Aggregation</w:t>
-      </w:r>
-    </w:p>
-    <w:p>
-      <w:pPr>
-        <w:rPr>
-          <w:lang w:val="en-US"/>
-        </w:rPr>
-      </w:pPr>
-      <w:r>
-        <w:rPr>
-          <w:lang w:val="en-US"/>
-        </w:rPr>
-        <w:t>Individual ligand-receptor communication probabilities were aggregated to evaluate signaling strengths at the pathway level (</w:t>
-      </w:r>
-      <w:proofErr w:type="spellStart"/>
-      <w:r>
-        <w:rPr>
-          <w:lang w:val="en-US"/>
-        </w:rPr>
-        <w:t>computeCommunProbPathway</w:t>
-      </w:r>
-      <w:proofErr w:type="spellEnd"/>
-      <w:r>
-        <w:rPr>
-          <w:lang w:val="en-US"/>
-        </w:rPr>
-        <w:t xml:space="preserve">). Total network interactions were synthesized using </w:t>
-      </w:r>
-      <w:proofErr w:type="spellStart"/>
-      <w:r>
-        <w:rPr>
-          <w:lang w:val="en-US"/>
-        </w:rPr>
-        <w:t>aggregateNet</w:t>
-      </w:r>
-      <w:proofErr w:type="spellEnd"/>
-      <w:r>
-        <w:rPr>
-          <w:lang w:val="en-US"/>
-        </w:rPr>
-        <w:t xml:space="preserve"> to generate cell-group interaction matrices corresponding to raw signaling counts and weighted communication probabilities (strength). In addition, cell-type-specific signaling subsets were generated by filtering communication outputs specifically for pericyte/fibroblast source populations (</w:t>
-      </w:r>
-      <w:proofErr w:type="spellStart"/>
-      <w:r>
-        <w:rPr>
-          <w:lang w:val="en-US"/>
-        </w:rPr>
-        <w:t>sources.use</w:t>
-      </w:r>
-      <w:proofErr w:type="spellEnd"/>
-      <w:r>
-        <w:rPr>
-          <w:lang w:val="en-US"/>
-        </w:rPr>
-        <w:t xml:space="preserve"> = "</w:t>
-      </w:r>
-      <w:proofErr w:type="spellStart"/>
-      <w:r>
-        <w:rPr>
-          <w:lang w:val="en-US"/>
-        </w:rPr>
-        <w:t>Pericyte_fibroblast</w:t>
-      </w:r>
-      <w:proofErr w:type="spellEnd"/>
-      <w:r>
-        <w:rPr>
-          <w:lang w:val="en-US"/>
-        </w:rPr>
-        <w:t>").</w:t>
-      </w:r>
-    </w:p>
-    <w:p>
-      <w:pPr>
-        <w:pStyle w:val="Heading3"/>
-        <w:rPr>
-          <w:lang w:val="en-US"/>
-        </w:rPr>
-      </w:pPr>
-      <w:r>
-        <w:rPr>
-          <w:lang w:val="en-US"/>
-        </w:rPr>
-        <w:t>Network Visualization and Ligand-Receptor Interactions</w:t>
-      </w:r>
-    </w:p>
-    <w:p>
-      <w:pPr>
-        <w:rPr>
-          <w:lang w:val="en-US"/>
-        </w:rPr>
-      </w:pPr>
-      <w:r>
-        <w:rPr>
-          <w:lang w:val="en-US"/>
-        </w:rPr>
-        <w:t>Macro-level communication structure was visualized using circular network plots (</w:t>
-      </w:r>
-      <w:proofErr w:type="spellStart"/>
-      <w:r>
-        <w:rPr>
-          <w:lang w:val="en-US"/>
-        </w:rPr>
-        <w:t>netVisual_circle</w:t>
-      </w:r>
-      <w:proofErr w:type="spellEnd"/>
-      <w:r>
-        <w:rPr>
-          <w:lang w:val="en-US"/>
-        </w:rPr>
-        <w:t>) displaying total interaction counts and weighted interaction strengths across all cell groups. Enriched signaling pathways were extracted, and individual pathway networks were rendered into high-resolution circular plots using automated layout functions (</w:t>
-      </w:r>
-      <w:proofErr w:type="spellStart"/>
-      <w:r>
-        <w:rPr>
-          <w:lang w:val="en-US"/>
-        </w:rPr>
-        <w:t>netVisual_aggregate</w:t>
-      </w:r>
-      <w:proofErr w:type="spellEnd"/>
-      <w:r>
-        <w:rPr>
-          <w:lang w:val="en-US"/>
-        </w:rPr>
-        <w:t xml:space="preserve">). Communication data frames containing inferred probabilities and significance metrics (p &lt; 0.01) were extracted via </w:t>
-      </w:r>
-      <w:proofErr w:type="spellStart"/>
-      <w:r>
-        <w:rPr>
-          <w:lang w:val="en-US"/>
-        </w:rPr>
-        <w:t>subsetCommunication</w:t>
-      </w:r>
-      <w:proofErr w:type="spellEnd"/>
-      <w:r>
-        <w:rPr>
-          <w:lang w:val="en-US"/>
-        </w:rPr>
-        <w:t>. Custom processing pipelines generated faceted dot plots visualizing communication probabilities across target cell pairs, evaluated both globally and specifically for fibroblast-directed interactions, while systematically comparing networks with and without self-communication.</w:t>
-      </w:r>
-    </w:p>
-    <w:p>
-      <w:pPr>
-        <w:pStyle w:val="Heading1"/>
-        <w:rPr>
-          <w:lang w:val="en-US"/>
-        </w:rPr>
-      </w:pPr>
-      <w:r>
-        <w:rPr>
-          <w:lang w:val="en-US"/>
-        </w:rPr>
-        <w:t>Results</w:t>
-      </w:r>
-    </w:p>
-    <w:p>
-      <w:pPr>
-        <w:pStyle w:val="Heading2"/>
-        <w:rPr>
-          <w:lang w:val="en-US"/>
-        </w:rPr>
-      </w:pPr>
-      <w:r>
-        <w:rPr>
-          <w:lang w:val="en-US"/>
-        </w:rPr>
-        <w:t>Data Loading</w:t>
-      </w:r>
-    </w:p>
-    <w:p>
-      <w:pPr>
-        <w:rPr>
-          <w:lang w:val="en-US"/>
-        </w:rPr>
-      </w:pPr>
-      <w:r>
-        <w:rPr>
-          <w:lang w:val="en-US"/>
-        </w:rPr>
-        <w:t>Single-cell transcriptomic profiles were successfully loaded across all five brain metastasis specimens (BRBMET2, BRBMET3, BRBMET87, LUBMET7, and LUBMET1), generating independent initial Seurat objects for each dataset.</w:t>
-      </w:r>
-    </w:p>
-    <w:p>
-      <w:pPr>
-        <w:pStyle w:val="Heading2"/>
-        <w:rPr>
-          <w:lang w:val="en-US"/>
-        </w:rPr>
-      </w:pPr>
-      <w:r>
-        <w:rPr>
-          <w:lang w:val="en-US"/>
-        </w:rPr>
-        <w:lastRenderedPageBreak/>
         <w:t>Quality Control and Doublet Removal</w:t>
       </w:r>
     </w:p>
@@ -3049,7 +3184,7 @@
                     </pic:cNvPicPr>
                   </pic:nvPicPr>
                   <pic:blipFill>
-                    <a:blip r:embed="rId13">
+                    <a:blip r:embed="rId16">
                       <a:extLst>
                         <a:ext uri="{28A0092B-C50C-407E-A947-70E740481C1C}">
                           <a14:useLocalDpi xmlns:a14="http://schemas.microsoft.com/office/drawing/2010/main" val="0"/>
@@ -3115,6 +3250,7 @@
         <w:rPr>
           <w:lang w:val="en-US"/>
         </w:rPr>
+        <w:lastRenderedPageBreak/>
         <w:t>Principal Component Analysis (PCA)</w:t>
       </w:r>
     </w:p>
@@ -3141,7 +3277,6 @@
         <w:rPr>
           <w:noProof/>
         </w:rPr>
-        <w:lastRenderedPageBreak/>
         <w:drawing>
           <wp:inline distT="0" distB="0" distL="0" distR="0" wp14:anchorId="0E69FC58" wp14:editId="4708DEA6">
             <wp:extent cx="3909060" cy="2680671"/>
@@ -3160,7 +3295,7 @@
                     </pic:cNvPicPr>
                   </pic:nvPicPr>
                   <pic:blipFill>
-                    <a:blip r:embed="rId14">
+                    <a:blip r:embed="rId17">
                       <a:extLst>
                         <a:ext uri="{28A0092B-C50C-407E-A947-70E740481C1C}">
                           <a14:useLocalDpi xmlns:a14="http://schemas.microsoft.com/office/drawing/2010/main" val="0"/>
@@ -3237,7 +3372,7 @@
                     </pic:cNvPicPr>
                   </pic:nvPicPr>
                   <pic:blipFill>
-                    <a:blip r:embed="rId15">
+                    <a:blip r:embed="rId18">
                       <a:extLst>
                         <a:ext uri="{28A0092B-C50C-407E-A947-70E740481C1C}">
                           <a14:useLocalDpi xmlns:a14="http://schemas.microsoft.com/office/drawing/2010/main" val="0"/>
@@ -3320,7 +3455,7 @@
                     </pic:cNvPicPr>
                   </pic:nvPicPr>
                   <pic:blipFill>
-                    <a:blip r:embed="rId16">
+                    <a:blip r:embed="rId19">
                       <a:extLst>
                         <a:ext uri="{28A0092B-C50C-407E-A947-70E740481C1C}">
                           <a14:useLocalDpi xmlns:a14="http://schemas.microsoft.com/office/drawing/2010/main" val="0"/>
@@ -3401,7 +3536,7 @@
                     </pic:cNvPicPr>
                   </pic:nvPicPr>
                   <pic:blipFill>
-                    <a:blip r:embed="rId17">
+                    <a:blip r:embed="rId20">
                       <a:extLst>
                         <a:ext uri="{28A0092B-C50C-407E-A947-70E740481C1C}">
                           <a14:useLocalDpi xmlns:a14="http://schemas.microsoft.com/office/drawing/2010/main" val="0"/>
@@ -3517,7 +3652,7 @@
                     </pic:cNvPicPr>
                   </pic:nvPicPr>
                   <pic:blipFill rotWithShape="1">
-                    <a:blip r:embed="rId18">
+                    <a:blip r:embed="rId21">
                       <a:extLst>
                         <a:ext uri="{28A0092B-C50C-407E-A947-70E740481C1C}">
                           <a14:useLocalDpi xmlns:a14="http://schemas.microsoft.com/office/drawing/2010/main" val="0"/>
@@ -3603,7 +3738,7 @@
                     </pic:cNvPicPr>
                   </pic:nvPicPr>
                   <pic:blipFill>
-                    <a:blip r:embed="rId19">
+                    <a:blip r:embed="rId22">
                       <a:extLst>
                         <a:ext uri="{28A0092B-C50C-407E-A947-70E740481C1C}">
                           <a14:useLocalDpi xmlns:a14="http://schemas.microsoft.com/office/drawing/2010/main" val="0"/>
@@ -3684,7 +3819,7 @@
                     </pic:cNvPicPr>
                   </pic:nvPicPr>
                   <pic:blipFill>
-                    <a:blip r:embed="rId20">
+                    <a:blip r:embed="rId23">
                       <a:extLst>
                         <a:ext uri="{28A0092B-C50C-407E-A947-70E740481C1C}">
                           <a14:useLocalDpi xmlns:a14="http://schemas.microsoft.com/office/drawing/2010/main" val="0"/>
@@ -3780,7 +3915,7 @@
                     </pic:cNvPicPr>
                   </pic:nvPicPr>
                   <pic:blipFill>
-                    <a:blip r:embed="rId21">
+                    <a:blip r:embed="rId24">
                       <a:extLst>
                         <a:ext uri="{28A0092B-C50C-407E-A947-70E740481C1C}">
                           <a14:useLocalDpi xmlns:a14="http://schemas.microsoft.com/office/drawing/2010/main" val="0"/>
@@ -3861,7 +3996,7 @@
                     </pic:cNvPicPr>
                   </pic:nvPicPr>
                   <pic:blipFill>
-                    <a:blip r:embed="rId22">
+                    <a:blip r:embed="rId25">
                       <a:extLst>
                         <a:ext uri="{28A0092B-C50C-407E-A947-70E740481C1C}">
                           <a14:useLocalDpi xmlns:a14="http://schemas.microsoft.com/office/drawing/2010/main" val="0"/>
@@ -3969,7 +4104,7 @@
                     </pic:cNvPicPr>
                   </pic:nvPicPr>
                   <pic:blipFill>
-                    <a:blip r:embed="rId23">
+                    <a:blip r:embed="rId26">
                       <a:extLst>
                         <a:ext uri="{28A0092B-C50C-407E-A947-70E740481C1C}">
                           <a14:useLocalDpi xmlns:a14="http://schemas.microsoft.com/office/drawing/2010/main" val="0"/>
@@ -4057,7 +4192,7 @@
                     </pic:cNvPicPr>
                   </pic:nvPicPr>
                   <pic:blipFill>
-                    <a:blip r:embed="rId24">
+                    <a:blip r:embed="rId27">
                       <a:extLst>
                         <a:ext uri="{28A0092B-C50C-407E-A947-70E740481C1C}">
                           <a14:useLocalDpi xmlns:a14="http://schemas.microsoft.com/office/drawing/2010/main" val="0"/>
@@ -4138,7 +4273,7 @@
                     </pic:cNvPicPr>
                   </pic:nvPicPr>
                   <pic:blipFill>
-                    <a:blip r:embed="rId25">
+                    <a:blip r:embed="rId28">
                       <a:extLst>
                         <a:ext uri="{28A0092B-C50C-407E-A947-70E740481C1C}">
                           <a14:useLocalDpi xmlns:a14="http://schemas.microsoft.com/office/drawing/2010/main" val="0"/>
@@ -4227,7 +4362,7 @@
                     </pic:cNvPicPr>
                   </pic:nvPicPr>
                   <pic:blipFill>
-                    <a:blip r:embed="rId26">
+                    <a:blip r:embed="rId29">
                       <a:extLst>
                         <a:ext uri="{28A0092B-C50C-407E-A947-70E740481C1C}">
                           <a14:useLocalDpi xmlns:a14="http://schemas.microsoft.com/office/drawing/2010/main" val="0"/>
@@ -4342,7 +4477,7 @@
                     </pic:cNvPicPr>
                   </pic:nvPicPr>
                   <pic:blipFill>
-                    <a:blip r:embed="rId27">
+                    <a:blip r:embed="rId30">
                       <a:extLst>
                         <a:ext uri="{28A0092B-C50C-407E-A947-70E740481C1C}">
                           <a14:useLocalDpi xmlns:a14="http://schemas.microsoft.com/office/drawing/2010/main" val="0"/>
@@ -4430,7 +4565,7 @@
                     </pic:cNvPicPr>
                   </pic:nvPicPr>
                   <pic:blipFill rotWithShape="1">
-                    <a:blip r:embed="rId28" cstate="print">
+                    <a:blip r:embed="rId31" cstate="print">
                       <a:extLst>
                         <a:ext uri="{28A0092B-C50C-407E-A947-70E740481C1C}">
                           <a14:useLocalDpi xmlns:a14="http://schemas.microsoft.com/office/drawing/2010/main" val="0"/>
@@ -4554,7 +4689,7 @@
                     </pic:cNvPicPr>
                   </pic:nvPicPr>
                   <pic:blipFill>
-                    <a:blip r:embed="rId29" cstate="print">
+                    <a:blip r:embed="rId32" cstate="print">
                       <a:extLst>
                         <a:ext uri="{28A0092B-C50C-407E-A947-70E740481C1C}">
                           <a14:useLocalDpi xmlns:a14="http://schemas.microsoft.com/office/drawing/2010/main" val="0"/>
@@ -4689,7 +4824,7 @@
                     </pic:cNvPicPr>
                   </pic:nvPicPr>
                   <pic:blipFill>
-                    <a:blip r:embed="rId30">
+                    <a:blip r:embed="rId33">
                       <a:extLst>
                         <a:ext uri="{28A0092B-C50C-407E-A947-70E740481C1C}">
                           <a14:useLocalDpi xmlns:a14="http://schemas.microsoft.com/office/drawing/2010/main" val="0"/>
@@ -4769,7 +4904,7 @@
                     </pic:cNvPicPr>
                   </pic:nvPicPr>
                   <pic:blipFill>
-                    <a:blip r:embed="rId31">
+                    <a:blip r:embed="rId34">
                       <a:extLst>
                         <a:ext uri="{28A0092B-C50C-407E-A947-70E740481C1C}">
                           <a14:useLocalDpi xmlns:a14="http://schemas.microsoft.com/office/drawing/2010/main" val="0"/>
@@ -4869,7 +5004,7 @@
                     </pic:cNvPicPr>
                   </pic:nvPicPr>
                   <pic:blipFill>
-                    <a:blip r:embed="rId32">
+                    <a:blip r:embed="rId35">
                       <a:extLst>
                         <a:ext uri="{28A0092B-C50C-407E-A947-70E740481C1C}">
                           <a14:useLocalDpi xmlns:a14="http://schemas.microsoft.com/office/drawing/2010/main" val="0"/>
@@ -4976,7 +5111,7 @@
                     </pic:cNvPicPr>
                   </pic:nvPicPr>
                   <pic:blipFill>
-                    <a:blip r:embed="rId33" cstate="print">
+                    <a:blip r:embed="rId36" cstate="print">
                       <a:extLst>
                         <a:ext uri="{28A0092B-C50C-407E-A947-70E740481C1C}">
                           <a14:useLocalDpi xmlns:a14="http://schemas.microsoft.com/office/drawing/2010/main" val="0"/>
@@ -5152,7 +5287,7 @@
                     </pic:cNvPicPr>
                   </pic:nvPicPr>
                   <pic:blipFill>
-                    <a:blip r:embed="rId34" cstate="print">
+                    <a:blip r:embed="rId37" cstate="print">
                       <a:extLst>
                         <a:ext uri="{28A0092B-C50C-407E-A947-70E740481C1C}">
                           <a14:useLocalDpi xmlns:a14="http://schemas.microsoft.com/office/drawing/2010/main" val="0"/>
@@ -5233,7 +5368,7 @@
                     </pic:cNvPicPr>
                   </pic:nvPicPr>
                   <pic:blipFill>
-                    <a:blip r:embed="rId35" cstate="print">
+                    <a:blip r:embed="rId38" cstate="print">
                       <a:extLst>
                         <a:ext uri="{28A0092B-C50C-407E-A947-70E740481C1C}">
                           <a14:useLocalDpi xmlns:a14="http://schemas.microsoft.com/office/drawing/2010/main" val="0"/>
@@ -5320,7 +5455,7 @@
                     </pic:cNvPicPr>
                   </pic:nvPicPr>
                   <pic:blipFill>
-                    <a:blip r:embed="rId36" cstate="print">
+                    <a:blip r:embed="rId39" cstate="print">
                       <a:extLst>
                         <a:ext uri="{28A0092B-C50C-407E-A947-70E740481C1C}">
                           <a14:useLocalDpi xmlns:a14="http://schemas.microsoft.com/office/drawing/2010/main" val="0"/>
@@ -5453,7 +5588,7 @@
                     </pic:cNvPicPr>
                   </pic:nvPicPr>
                   <pic:blipFill>
-                    <a:blip r:embed="rId37" cstate="print">
+                    <a:blip r:embed="rId40" cstate="print">
                       <a:extLst>
                         <a:ext uri="{28A0092B-C50C-407E-A947-70E740481C1C}">
                           <a14:useLocalDpi xmlns:a14="http://schemas.microsoft.com/office/drawing/2010/main" val="0"/>
@@ -5555,7 +5690,7 @@
                     </pic:cNvPicPr>
                   </pic:nvPicPr>
                   <pic:blipFill>
-                    <a:blip r:embed="rId38" cstate="print">
+                    <a:blip r:embed="rId41" cstate="print">
                       <a:extLst>
                         <a:ext uri="{28A0092B-C50C-407E-A947-70E740481C1C}">
                           <a14:useLocalDpi xmlns:a14="http://schemas.microsoft.com/office/drawing/2010/main" val="0"/>
@@ -5628,7 +5763,7 @@
                     </pic:cNvPicPr>
                   </pic:nvPicPr>
                   <pic:blipFill>
-                    <a:blip r:embed="rId39" cstate="print">
+                    <a:blip r:embed="rId42" cstate="print">
                       <a:extLst>
                         <a:ext uri="{28A0092B-C50C-407E-A947-70E740481C1C}">
                           <a14:useLocalDpi xmlns:a14="http://schemas.microsoft.com/office/drawing/2010/main" val="0"/>
@@ -5702,7 +5837,7 @@
                     </pic:cNvPicPr>
                   </pic:nvPicPr>
                   <pic:blipFill>
-                    <a:blip r:embed="rId40" cstate="print">
+                    <a:blip r:embed="rId43" cstate="print">
                       <a:extLst>
                         <a:ext uri="{28A0092B-C50C-407E-A947-70E740481C1C}">
                           <a14:useLocalDpi xmlns:a14="http://schemas.microsoft.com/office/drawing/2010/main" val="0"/>
@@ -5797,7 +5932,7 @@
                     </pic:cNvPicPr>
                   </pic:nvPicPr>
                   <pic:blipFill>
-                    <a:blip r:embed="rId41" cstate="print">
+                    <a:blip r:embed="rId44" cstate="print">
                       <a:extLst>
                         <a:ext uri="{28A0092B-C50C-407E-A947-70E740481C1C}">
                           <a14:useLocalDpi xmlns:a14="http://schemas.microsoft.com/office/drawing/2010/main" val="0"/>
@@ -5939,7 +6074,7 @@
                     </pic:cNvPicPr>
                   </pic:nvPicPr>
                   <pic:blipFill rotWithShape="1">
-                    <a:blip r:embed="rId42" cstate="print">
+                    <a:blip r:embed="rId45" cstate="print">
                       <a:extLst>
                         <a:ext uri="{28A0092B-C50C-407E-A947-70E740481C1C}">
                           <a14:useLocalDpi xmlns:a14="http://schemas.microsoft.com/office/drawing/2010/main" val="0"/>
@@ -6025,7 +6160,7 @@
                     </pic:cNvPicPr>
                   </pic:nvPicPr>
                   <pic:blipFill rotWithShape="1">
-                    <a:blip r:embed="rId43" cstate="print">
+                    <a:blip r:embed="rId46" cstate="print">
                       <a:extLst>
                         <a:ext uri="{28A0092B-C50C-407E-A947-70E740481C1C}">
                           <a14:useLocalDpi xmlns:a14="http://schemas.microsoft.com/office/drawing/2010/main" val="0"/>
@@ -6193,7 +6328,7 @@
                     </pic:cNvPicPr>
                   </pic:nvPicPr>
                   <pic:blipFill rotWithShape="1">
-                    <a:blip r:embed="rId44" cstate="print">
+                    <a:blip r:embed="rId47" cstate="print">
                       <a:extLst>
                         <a:ext uri="{28A0092B-C50C-407E-A947-70E740481C1C}">
                           <a14:useLocalDpi xmlns:a14="http://schemas.microsoft.com/office/drawing/2010/main" val="0"/>
@@ -6297,7 +6432,7 @@
                     <pic:cNvPicPr/>
                   </pic:nvPicPr>
                   <pic:blipFill rotWithShape="1">
-                    <a:blip r:embed="rId45"/>
+                    <a:blip r:embed="rId48"/>
                     <a:srcRect r="2403"/>
                     <a:stretch>
                       <a:fillRect/>
@@ -6446,7 +6581,7 @@
                     </pic:cNvPicPr>
                   </pic:nvPicPr>
                   <pic:blipFill>
-                    <a:blip r:embed="rId46" cstate="print">
+                    <a:blip r:embed="rId49" cstate="print">
                       <a:extLst>
                         <a:ext uri="{28A0092B-C50C-407E-A947-70E740481C1C}">
                           <a14:useLocalDpi xmlns:a14="http://schemas.microsoft.com/office/drawing/2010/main" val="0"/>
@@ -7312,7 +7447,7 @@
                     </pic:cNvPicPr>
                   </pic:nvPicPr>
                   <pic:blipFill>
-                    <a:blip r:embed="rId47">
+                    <a:blip r:embed="rId50">
                       <a:extLst>
                         <a:ext uri="{28A0092B-C50C-407E-A947-70E740481C1C}">
                           <a14:useLocalDpi xmlns:a14="http://schemas.microsoft.com/office/drawing/2010/main" val="0"/>
@@ -7825,7 +7960,7 @@
                     </pic:cNvPicPr>
                   </pic:nvPicPr>
                   <pic:blipFill>
-                    <a:blip r:embed="rId48">
+                    <a:blip r:embed="rId51">
                       <a:extLst>
                         <a:ext uri="{28A0092B-C50C-407E-A947-70E740481C1C}">
                           <a14:useLocalDpi xmlns:a14="http://schemas.microsoft.com/office/drawing/2010/main" val="0"/>
@@ -7859,7 +7994,7 @@
     </w:p>
     <w:p/>
     <w:sectPr>
-      <w:footerReference w:type="default" r:id="rId49"/>
+      <w:footerReference w:type="default" r:id="rId52"/>
       <w:pgSz w:w="12240" w:h="15840"/>
       <w:pgMar w:top="1440" w:right="1440" w:bottom="1440" w:left="1440" w:header="720" w:footer="720" w:gutter="0"/>
       <w:cols w:space="720"/>

</xml_diff>